<commit_message>
Fix all content issues: BQ alignment, section numbering, CCOUNT, Appendix B, storage locations, future tense
</commit_message>
<xml_diff>
--- a/report_4/Integrated_Report_4.docx
+++ b/report_4/Integrated_Report_4.docx
@@ -50,10 +50,55 @@
         <w:rPr>
           <w:b/>
         </w:rPr>
+        <w:t>Members:</w:t>
+      </w:r>
+      <w:r>
+        <w:t xml:space="preserve"> [Member 1 Name], [Member 2 Name], [Member 3 Name], [Member 4 Name]  </w:t>
+      </w:r>
+    </w:p>
+    <w:p>
+      <w:pPr>
+        <w:spacing w:after="40"/>
+      </w:pPr>
+      <w:r/>
+      <w:r>
+        <w:rPr>
+          <w:b/>
+        </w:rPr>
+        <w:t>Group Number:</w:t>
+      </w:r>
+      <w:r>
+        <w:t xml:space="preserve"> 1  </w:t>
+      </w:r>
+    </w:p>
+    <w:p>
+      <w:pPr>
+        <w:spacing w:after="40"/>
+      </w:pPr>
+      <w:r/>
+      <w:r>
+        <w:rPr>
+          <w:b/>
+        </w:rPr>
+        <w:t>Contact Email:</w:t>
+      </w:r>
+      <w:r>
+        <w:t xml:space="preserve"> [team-email@tamu.edu]  </w:t>
+      </w:r>
+    </w:p>
+    <w:p>
+      <w:pPr>
+        <w:spacing w:after="40"/>
+      </w:pPr>
+      <w:r/>
+      <w:r>
+        <w:rPr>
+          <w:b/>
+        </w:rPr>
         <w:t>Date:</w:t>
       </w:r>
       <w:r>
-        <w:t xml:space="preserve"> April 8, 2026</w:t>
+        <w:t xml:space="preserve"> April 27, 2026</w:t>
       </w:r>
     </w:p>
     <w:p>
@@ -1246,6 +1291,30 @@
       </w:r>
       <w:r>
         <w:t>: Many-to-one on STORE + WEEK. Each movement week maps to customer traffic.</w:t>
+      </w:r>
+    </w:p>
+    <w:p>
+      <w:pPr>
+        <w:spacing w:after="40"/>
+      </w:pPr>
+      <w:r/>
+      <w:r>
+        <w:rPr>
+          <w:b/>
+        </w:rPr>
+        <w:t>Note on CCOUNT.csv:</w:t>
+      </w:r>
+      <w:r>
+        <w:t xml:space="preserve"> Although CCOUNT.csv is part of the DFF dataset and is referenced above for completeness, it was </w:t>
+      </w:r>
+      <w:r>
+        <w:rPr>
+          <w:b/>
+        </w:rPr>
+        <w:t>excluded from the ETL implementation</w:t>
+      </w:r>
+      <w:r>
+        <w:t>. The DATE column in CCOUNT is corrupted (contains non-date values), and the file’s daily grain does not align with the weekly grain of the Movement files. Since none of the 5 professor-selected BQs require customer traffic data (CUSTCOUN), including CCOUNT would add complexity without supporting any implemented business question. The data quality issues in CCOUNT were documented in Section 1.4.</w:t>
       </w:r>
     </w:p>
     <w:p>
@@ -3474,7 +3543,7 @@
         <w:pStyle w:val="Heading2"/>
       </w:pPr>
       <w:r>
-        <w:t>4.1 Selected Business Questions</w:t>
+        <w:t>3.2 Selected Business Questions</w:t>
       </w:r>
     </w:p>
     <w:p>
@@ -3945,7 +4014,7 @@
         <w:pStyle w:val="Heading2"/>
       </w:pPr>
       <w:r>
-        <w:t>4.2 Star Schema — Table Definitions</w:t>
+        <w:t>3.3 Star Schema — Table Definitions</w:t>
       </w:r>
     </w:p>
     <w:p>
@@ -8169,7 +8238,7 @@
         <w:pStyle w:val="Heading2"/>
       </w:pPr>
       <w:r>
-        <w:t>4.3 Schema Justification — How Each BQ Is Supported</w:t>
+        <w:t>3.4 Schema Justification — How Each BQ Is Supported</w:t>
       </w:r>
     </w:p>
     <w:p>
@@ -8252,7 +8321,7 @@
         <w:pStyle w:val="Heading2"/>
       </w:pPr>
       <w:r>
-        <w:t>4.4 Star Schema Diagram</w:t>
+        <w:t>3.5 Star Schema Diagram</w:t>
       </w:r>
     </w:p>
     <w:tbl>
@@ -8296,7 +8365,7 @@
         <w:pStyle w:val="Heading2"/>
       </w:pPr>
       <w:r>
-        <w:t>4.5 Mapping Table #1: Source Files to Staging Tables</w:t>
+        <w:t>3.6 Mapping Table #1: Source Files to Staging Tables</w:t>
       </w:r>
     </w:p>
     <w:tbl>
@@ -15729,7 +15798,7 @@
         <w:pStyle w:val="Heading2"/>
       </w:pPr>
       <w:r>
-        <w:t>4.6 Mapping Table #2: Staging Tables to Data Mart Tables</w:t>
+        <w:t>3.7 Mapping Table #2: Staging Tables to Data Mart Tables</w:t>
       </w:r>
     </w:p>
     <w:tbl>
@@ -17490,7 +17559,7 @@
         <w:pStyle w:val="Heading2"/>
       </w:pPr>
       <w:r>
-        <w:t>4.7 Physical Design Plan</w:t>
+        <w:t>3.8 Physical Design Plan</w:t>
       </w:r>
     </w:p>
     <w:p>
@@ -17504,7 +17573,7 @@
         <w:t>data aggregate plan</w:t>
       </w:r>
       <w:r>
-        <w:t xml:space="preserve">, three summary tables are planned: agg_Weekly_Category_Sales (pre-aggregates units_sold and revenue by week and category to accelerate BQ2), agg_Store_Category_Revenue (aggregates total revenue by store and category for BQ8 quartile analysis), and agg_Weekly_Product_Sales (aggregates units_sold by week and product within a category for BQ9 ranking). These aggregate fact tables echo the original FactWeeklySales structure at reduced grain, following Kimball's guidance. For </w:t>
+        <w:t xml:space="preserve">, three summary tables were created: agg_Weekly_Category_Sales (pre-aggregates units_sold and revenue by week and category to accelerate BQ2), agg_Store_Category_Revenue (aggregates total revenue by store and category for BQ8 quartile analysis), and agg_Weekly_Product_Sales (aggregates units_sold by week and product within a category for BQ9 ranking). These aggregate fact tables echo the original FactWeeklySales structure at reduced grain, following Kimball’s guidance. For </w:t>
       </w:r>
       <w:r>
         <w:rPr>
@@ -17513,7 +17582,7 @@
         <w:t>indexing</w:t>
       </w:r>
       <w:r>
-        <w:t>, the FactWeeklySales table uses a clustered index on sales_fact_id (primary key) with nonclustered indexes on (time_key, store_key, product_key) for composite lookups and single-column nonclustered indexes on promotion_key and category_key for BQ-specific filtering. Dimension tables use unique nonclustered indexes on surrogate primary keys and additional nonclustered indexes on frequently filtered columns (deal_code, is_promoted, price_tier, is_urban, department). During bulk ETL loads, indexes are dropped before loading and recreated afterward to avoid performance degradation.</w:t>
+        <w:t>, the FactWeeklySales table uses a clustered index on sales_fact_id (primary key) with nonclustered indexes on (time_key, store_key, product_key) for composite lookups and single-column nonclustered indexes on promotion_key and category_key for BQ-specific filtering. Dimension tables use unique nonclustered indexes on surrogate primary keys and additional nonclustered indexes on frequently filtered columns (deal_code, is_promoted, price_tier, is_urban, department). During bulk ETL loads, indexes were dropped before loading and recreated afterward to avoid performance degradation.</w:t>
       </w:r>
     </w:p>
     <w:p>
@@ -17536,7 +17605,7 @@
         <w:t>storage</w:t>
       </w:r>
       <w:r>
-        <w:t>, the large FactWeeklySales table (~34.6M rows, ~4-5 GB) will be horizontally partitioned by time_key (yearly partitions). Total estimated storage is 8-10 GB including indexes. The data mart architecture ensures new categories or business processes can be added without modifying existing tables.</w:t>
+        <w:t>, the large FactWeeklySales table (~34.6M rows, ~4-5 GB) is horizontally partitioned by time_key (yearly partitions). Total estimated storage is 8-10 GB including indexes. The data mart architecture ensures new categories or business processes can be added without modifying existing tables.</w:t>
       </w:r>
     </w:p>
     <w:p>
@@ -17573,7 +17642,7 @@
         <w:pStyle w:val="Heading2"/>
       </w:pPr>
       <w:r>
-        <w:t>5.1 All Target Data in the Data Warehouse</w:t>
+        <w:t>4.1.1 All Target Data in the Data Warehouse</w:t>
       </w:r>
     </w:p>
     <w:p>
@@ -18015,7 +18084,7 @@
         <w:pStyle w:val="Heading2"/>
       </w:pPr>
       <w:r>
-        <w:t>5.2 All Data Sources</w:t>
+        <w:t>4.1.2 All Data Sources</w:t>
       </w:r>
     </w:p>
     <w:tbl>
@@ -18769,12 +18838,12 @@
         <w:pStyle w:val="Heading2"/>
       </w:pPr>
       <w:r>
-        <w:t>5.3 Data Mappings</w:t>
+        <w:t>4.1.3 Data Mappings</w:t>
       </w:r>
     </w:p>
     <w:p>
       <w:r>
-        <w:t>Two mapping tables have been prepared in Excel format (see Sections 4.5 and 4.6):</w:t>
+        <w:t>Two mapping tables were prepared in Excel format (see Sections 3.6 and 3.7):</w:t>
       </w:r>
     </w:p>
     <w:p>
@@ -18867,7 +18936,7 @@
         <w:pStyle w:val="Heading2"/>
       </w:pPr>
       <w:r>
-        <w:t>5.4 Comprehensive Data Extraction Rules</w:t>
+        <w:t>4.1.4 Comprehensive Data Extraction Rules</w:t>
       </w:r>
     </w:p>
     <w:tbl>
@@ -19162,7 +19231,7 @@
         <w:pStyle w:val="Heading2"/>
       </w:pPr>
       <w:r>
-        <w:t>5.5 Data Transformation and Cleansing Rules</w:t>
+        <w:t>4.1.5 Data Transformation and Cleansing Rules</w:t>
       </w:r>
     </w:p>
     <w:tbl>
@@ -20636,12 +20705,12 @@
         <w:pStyle w:val="Heading2"/>
       </w:pPr>
       <w:r>
-        <w:t>5.6 Plan for Aggregate Tables</w:t>
+        <w:t>4.1.6 Aggregate Tables</w:t>
       </w:r>
     </w:p>
     <w:p>
       <w:r>
-        <w:t>Three pre-computed aggregate tables will be created to improve query performance:</w:t>
+        <w:t>Three pre-computed aggregate tables were created to improve query performance:</w:t>
       </w:r>
     </w:p>
     <w:tbl>
@@ -20909,7 +20978,7 @@
         <w:pStyle w:val="Heading2"/>
       </w:pPr>
       <w:r>
-        <w:t>5.7 Organization of Data Staging Area</w:t>
+        <w:t>4.1.7 Organization of Data Staging Area</w:t>
       </w:r>
     </w:p>
     <w:p>
@@ -21091,7 +21160,7 @@
         <w:pStyle w:val="Heading2"/>
       </w:pPr>
       <w:r>
-        <w:t>5.8 Procedures for All Data Extractions and Loadings</w:t>
+        <w:t>4.1.8 Procedures for All Data Extractions and Loadings</w:t>
       </w:r>
     </w:p>
     <w:p>
@@ -21149,7 +21218,7 @@
         <w:pStyle w:val="Heading2"/>
       </w:pPr>
       <w:r>
-        <w:t>5.9 ETL for Dimension Table</w:t>
+        <w:t>4.1.9 ETL for Dimension Table</w:t>
       </w:r>
     </w:p>
     <w:p>
@@ -21246,7 +21315,7 @@
         <w:pStyle w:val="Heading2"/>
       </w:pPr>
       <w:r>
-        <w:t>5.10 ETL for Fact Table</w:t>
+        <w:t>4.1.10 ETL for Fact Table</w:t>
       </w:r>
     </w:p>
     <w:p>
@@ -21335,7 +21404,7 @@
         <w:pStyle w:val="Heading2"/>
       </w:pPr>
       <w:r>
-        <w:t>6.1 Database Creation</w:t>
+        <w:t>4.2.1 Database Creation</w:t>
       </w:r>
     </w:p>
     <w:p>
@@ -21401,7 +21470,7 @@
         <w:pStyle w:val="Heading2"/>
       </w:pPr>
       <w:r>
-        <w:t>6.2 Staging Table Creation</w:t>
+        <w:t>4.2.2 Staging Table Creation</w:t>
       </w:r>
     </w:p>
     <w:p>
@@ -21472,7 +21541,7 @@
         <w:pStyle w:val="Heading2"/>
       </w:pPr>
       <w:r>
-        <w:t>6.3 Data Mart Table Creation</w:t>
+        <w:t>4.2.3 Data Mart Table Creation</w:t>
       </w:r>
     </w:p>
     <w:p>
@@ -21543,7 +21612,7 @@
         <w:pStyle w:val="Heading2"/>
       </w:pPr>
       <w:r>
-        <w:t>6.4 SSIS Package 1: Extract to Staging</w:t>
+        <w:t>4.2.4 SSIS Package 1: Extract to Staging</w:t>
       </w:r>
     </w:p>
     <w:p>
@@ -21965,7 +22034,7 @@
         <w:pStyle w:val="Heading2"/>
       </w:pPr>
       <w:r>
-        <w:t>6.5 SSIS Package 2: Transform Staging</w:t>
+        <w:t>4.2.5 SSIS Package 2: Transform Staging</w:t>
       </w:r>
     </w:p>
     <w:p>
@@ -22239,7 +22308,7 @@
         <w:pStyle w:val="Heading2"/>
       </w:pPr>
       <w:r>
-        <w:t>6.6 SSIS Package 3: Load Data Mart</w:t>
+        <w:t>4.2.6 SSIS Package 3: Load Data Mart</w:t>
       </w:r>
     </w:p>
     <w:p>
@@ -22782,7 +22851,7 @@
         <w:pStyle w:val="Heading2"/>
       </w:pPr>
       <w:r>
-        <w:t>6.7 Temporary Table Cleanup</w:t>
+        <w:t>4.2.7 Temporary Table Cleanup</w:t>
       </w:r>
     </w:p>
     <w:p>
@@ -22829,7 +22898,7 @@
         <w:pStyle w:val="Heading2"/>
       </w:pPr>
       <w:r>
-        <w:t>6.8 Granularity Discussion</w:t>
+        <w:t>4.2.8 Granularity Discussion</w:t>
       </w:r>
     </w:p>
     <w:p>
@@ -22901,7 +22970,7 @@
         <w:pStyle w:val="Heading2"/>
       </w:pPr>
       <w:r>
-        <w:t>6.9 Business Question Verification</w:t>
+        <w:t>4.2.9 Business Question Verification</w:t>
       </w:r>
     </w:p>
     <w:p>
@@ -23280,7 +23349,7 @@
         <w:pStyle w:val="Heading2"/>
       </w:pPr>
       <w:r>
-        <w:t>6.10 Final Data Mart Summary</w:t>
+        <w:t>4.2.10 Final Data Mart Summary</w:t>
       </w:r>
     </w:p>
     <w:tbl>
@@ -23730,7 +23799,18 @@
     </w:p>
     <w:p>
       <w:r>
-        <w:t>This section presents the final phase of the data warehousing lifecycle: developing BI reports to serve end users. Using a variety of reporting tools, we construct decision-support reports to answer the five target Business Questions (BQs).</w:t>
+        <w:t xml:space="preserve">This section presents the final phase of the data warehousing lifecycle: delivering BI reports to end users. Using four distinct reporting tools — SSRS, SSAS, Redshift Query v.2, and Power BI — we built decision-support reports that answer the five professor-approved Business Questions (BQ2, BQ3, BQ4, BQ8, BQ9). Each report draws directly from the </w:t>
+      </w:r>
+      <w:r>
+        <w:rPr>
+          <w:rFonts w:ascii="Consolas" w:hAnsi="Consolas"/>
+          <w:color w:val="C0392B"/>
+          <w:sz w:val="18"/>
+        </w:rPr>
+        <w:t>team1_dw_area</w:t>
+      </w:r>
+      <w:r>
+        <w:t xml:space="preserve"> data mart on SQL Server 2016.</w:t>
       </w:r>
     </w:p>
     <w:p>
@@ -23751,7 +23831,775 @@
     </w:p>
     <w:p>
       <w:r>
-        <w:t>Our goal is to comprehensively answer BQ2, BQ3, BQ4, BQ8, and BQ9 using the BI capabilities of our Hybrid Data Pipeline.</w:t>
+        <w:t>The following table maps each BQ to the BI tool used and the report type produced:</w:t>
+      </w:r>
+    </w:p>
+    <w:tbl>
+      <w:tblPr>
+        <w:tblStyle w:val="TableGrid"/>
+        <w:tblW w:type="auto" w:w="0"/>
+        <w:jc w:val="center"/>
+        <w:tblLook w:firstColumn="1" w:firstRow="1" w:lastColumn="0" w:lastRow="0" w:noHBand="0" w:noVBand="1" w:val="04A0"/>
+      </w:tblPr>
+      <w:tblGrid>
+        <w:gridCol w:w="2340"/>
+        <w:gridCol w:w="2340"/>
+        <w:gridCol w:w="2340"/>
+        <w:gridCol w:w="2340"/>
+      </w:tblGrid>
+      <w:tr>
+        <w:tc>
+          <w:tcPr>
+            <w:tcW w:type="dxa" w:w="2340"/>
+            <w:shd w:fill="D9E2F3" w:val="clear"/>
+          </w:tcPr>
+          <w:p>
+            <w:r/>
+            <w:r>
+              <w:rPr>
+                <w:b/>
+                <w:sz w:val="18"/>
+              </w:rPr>
+              <w:t>BQ</w:t>
+            </w:r>
+          </w:p>
+        </w:tc>
+        <w:tc>
+          <w:tcPr>
+            <w:tcW w:type="dxa" w:w="2340"/>
+            <w:shd w:fill="D9E2F3" w:val="clear"/>
+          </w:tcPr>
+          <w:p>
+            <w:r/>
+            <w:r>
+              <w:rPr>
+                <w:b/>
+                <w:sz w:val="18"/>
+              </w:rPr>
+              <w:t>Business Question</w:t>
+            </w:r>
+          </w:p>
+        </w:tc>
+        <w:tc>
+          <w:tcPr>
+            <w:tcW w:type="dxa" w:w="2340"/>
+            <w:shd w:fill="D9E2F3" w:val="clear"/>
+          </w:tcPr>
+          <w:p>
+            <w:r/>
+            <w:r>
+              <w:rPr>
+                <w:b/>
+                <w:sz w:val="18"/>
+              </w:rPr>
+              <w:t>BI Tool</w:t>
+            </w:r>
+          </w:p>
+        </w:tc>
+        <w:tc>
+          <w:tcPr>
+            <w:tcW w:type="dxa" w:w="2340"/>
+            <w:shd w:fill="D9E2F3" w:val="clear"/>
+          </w:tcPr>
+          <w:p>
+            <w:r/>
+            <w:r>
+              <w:rPr>
+                <w:b/>
+                <w:sz w:val="18"/>
+              </w:rPr>
+              <w:t>Report Type</w:t>
+            </w:r>
+          </w:p>
+        </w:tc>
+      </w:tr>
+      <w:tr>
+        <w:tc>
+          <w:tcPr>
+            <w:tcW w:type="dxa" w:w="2340"/>
+          </w:tcPr>
+          <w:p>
+            <w:r/>
+            <w:r>
+              <w:rPr>
+                <w:sz w:val="18"/>
+              </w:rPr>
+              <w:t>BQ2</w:t>
+            </w:r>
+          </w:p>
+        </w:tc>
+        <w:tc>
+          <w:tcPr>
+            <w:tcW w:type="dxa" w:w="2340"/>
+          </w:tcPr>
+          <w:p>
+            <w:r/>
+            <w:r>
+              <w:rPr>
+                <w:sz w:val="18"/>
+              </w:rPr>
+              <w:t>What were the total weekly unit sales of Soft Drinks across all stores?</w:t>
+            </w:r>
+          </w:p>
+        </w:tc>
+        <w:tc>
+          <w:tcPr>
+            <w:tcW w:type="dxa" w:w="2340"/>
+          </w:tcPr>
+          <w:p>
+            <w:r/>
+            <w:r>
+              <w:rPr>
+                <w:sz w:val="18"/>
+              </w:rPr>
+              <w:t>SSRS</w:t>
+            </w:r>
+          </w:p>
+        </w:tc>
+        <w:tc>
+          <w:tcPr>
+            <w:tcW w:type="dxa" w:w="2340"/>
+          </w:tcPr>
+          <w:p>
+            <w:r/>
+            <w:r>
+              <w:rPr>
+                <w:sz w:val="18"/>
+              </w:rPr>
+              <w:t>Tabular report with weekly trend chart</w:t>
+            </w:r>
+          </w:p>
+        </w:tc>
+      </w:tr>
+      <w:tr>
+        <w:tc>
+          <w:tcPr>
+            <w:tcW w:type="dxa" w:w="2340"/>
+          </w:tcPr>
+          <w:p>
+            <w:r/>
+            <w:r>
+              <w:rPr>
+                <w:sz w:val="18"/>
+              </w:rPr>
+              <w:t>BQ3</w:t>
+            </w:r>
+          </w:p>
+        </w:tc>
+        <w:tc>
+          <w:tcPr>
+            <w:tcW w:type="dxa" w:w="2340"/>
+          </w:tcPr>
+          <w:p>
+            <w:r/>
+            <w:r>
+              <w:rPr>
+                <w:sz w:val="18"/>
+              </w:rPr>
+              <w:t>How do promotion weeks compare to non-promotion weeks in terms of sales volume?</w:t>
+            </w:r>
+          </w:p>
+        </w:tc>
+        <w:tc>
+          <w:tcPr>
+            <w:tcW w:type="dxa" w:w="2340"/>
+          </w:tcPr>
+          <w:p>
+            <w:r/>
+            <w:r>
+              <w:rPr>
+                <w:sz w:val="18"/>
+              </w:rPr>
+              <w:t>SSAS</w:t>
+            </w:r>
+          </w:p>
+        </w:tc>
+        <w:tc>
+          <w:tcPr>
+            <w:tcW w:type="dxa" w:w="2340"/>
+          </w:tcPr>
+          <w:p>
+            <w:r/>
+            <w:r>
+              <w:rPr>
+                <w:sz w:val="18"/>
+              </w:rPr>
+              <w:t>Cube-based pivot with drill-down by deal type</w:t>
+            </w:r>
+          </w:p>
+        </w:tc>
+      </w:tr>
+      <w:tr>
+        <w:tc>
+          <w:tcPr>
+            <w:tcW w:type="dxa" w:w="2340"/>
+          </w:tcPr>
+          <w:p>
+            <w:r/>
+            <w:r>
+              <w:rPr>
+                <w:sz w:val="18"/>
+              </w:rPr>
+              <w:t>BQ4</w:t>
+            </w:r>
+          </w:p>
+        </w:tc>
+        <w:tc>
+          <w:tcPr>
+            <w:tcW w:type="dxa" w:w="2340"/>
+          </w:tcPr>
+          <w:p>
+            <w:r/>
+            <w:r>
+              <w:rPr>
+                <w:sz w:val="18"/>
+              </w:rPr>
+              <w:t>Which promotion type (B/C/S) generated the highest incremental unit sales lift in Canned Soup?</w:t>
+            </w:r>
+          </w:p>
+        </w:tc>
+        <w:tc>
+          <w:tcPr>
+            <w:tcW w:type="dxa" w:w="2340"/>
+          </w:tcPr>
+          <w:p>
+            <w:r/>
+            <w:r>
+              <w:rPr>
+                <w:sz w:val="18"/>
+              </w:rPr>
+              <w:t>Redshift Query v.2</w:t>
+            </w:r>
+          </w:p>
+        </w:tc>
+        <w:tc>
+          <w:tcPr>
+            <w:tcW w:type="dxa" w:w="2340"/>
+          </w:tcPr>
+          <w:p>
+            <w:r/>
+            <w:r>
+              <w:rPr>
+                <w:sz w:val="18"/>
+              </w:rPr>
+              <w:t>Query results with lift multiplier comparison</w:t>
+            </w:r>
+          </w:p>
+        </w:tc>
+      </w:tr>
+      <w:tr>
+        <w:tc>
+          <w:tcPr>
+            <w:tcW w:type="dxa" w:w="2340"/>
+          </w:tcPr>
+          <w:p>
+            <w:r/>
+            <w:r>
+              <w:rPr>
+                <w:sz w:val="18"/>
+              </w:rPr>
+              <w:t>BQ8</w:t>
+            </w:r>
+          </w:p>
+        </w:tc>
+        <w:tc>
+          <w:tcPr>
+            <w:tcW w:type="dxa" w:w="2340"/>
+          </w:tcPr>
+          <w:p>
+            <w:r/>
+            <w:r>
+              <w:rPr>
+                <w:sz w:val="18"/>
+              </w:rPr>
+              <w:t>Which stores fall into the top 25%, middle 50%, and bottom 25% of total Toothpaste revenue, and how do their demographics differ?</w:t>
+            </w:r>
+          </w:p>
+        </w:tc>
+        <w:tc>
+          <w:tcPr>
+            <w:tcW w:type="dxa" w:w="2340"/>
+          </w:tcPr>
+          <w:p>
+            <w:r/>
+            <w:r>
+              <w:rPr>
+                <w:sz w:val="18"/>
+              </w:rPr>
+              <w:t>Power BI</w:t>
+            </w:r>
+          </w:p>
+        </w:tc>
+        <w:tc>
+          <w:tcPr>
+            <w:tcW w:type="dxa" w:w="2340"/>
+          </w:tcPr>
+          <w:p>
+            <w:r/>
+            <w:r>
+              <w:rPr>
+                <w:sz w:val="18"/>
+              </w:rPr>
+              <w:t>Interactive dashboard with quartile segmentation</w:t>
+            </w:r>
+          </w:p>
+        </w:tc>
+      </w:tr>
+      <w:tr>
+        <w:tc>
+          <w:tcPr>
+            <w:tcW w:type="dxa" w:w="2340"/>
+          </w:tcPr>
+          <w:p>
+            <w:r/>
+            <w:r>
+              <w:rPr>
+                <w:sz w:val="18"/>
+              </w:rPr>
+              <w:t>BQ9</w:t>
+            </w:r>
+          </w:p>
+        </w:tc>
+        <w:tc>
+          <w:tcPr>
+            <w:tcW w:type="dxa" w:w="2340"/>
+          </w:tcPr>
+          <w:p>
+            <w:r/>
+            <w:r>
+              <w:rPr>
+                <w:sz w:val="18"/>
+              </w:rPr>
+              <w:t>For each week, rank the top 10 Cracker products by unit sales and show their week-over-week sales change.</w:t>
+            </w:r>
+          </w:p>
+        </w:tc>
+        <w:tc>
+          <w:tcPr>
+            <w:tcW w:type="dxa" w:w="2340"/>
+          </w:tcPr>
+          <w:p>
+            <w:r/>
+            <w:r>
+              <w:rPr>
+                <w:sz w:val="18"/>
+              </w:rPr>
+              <w:t>SSRS</w:t>
+            </w:r>
+          </w:p>
+        </w:tc>
+        <w:tc>
+          <w:tcPr>
+            <w:tcW w:type="dxa" w:w="2340"/>
+          </w:tcPr>
+          <w:p>
+            <w:r/>
+            <w:r>
+              <w:rPr>
+                <w:sz w:val="18"/>
+              </w:rPr>
+              <w:t>Parameterized report with weekly product ranking</w:t>
+            </w:r>
+          </w:p>
+        </w:tc>
+      </w:tr>
+    </w:tbl>
+    <w:p/>
+    <w:p>
+      <w:pPr>
+        <w:pStyle w:val="Heading3"/>
+      </w:pPr>
+      <w:r>
+        <w:t>5.1.2 Data Mappings from Data Marts to Report Attributes</w:t>
+      </w:r>
+    </w:p>
+    <w:p>
+      <w:r>
+        <w:t>Each report attribute maps directly to the star schema defined in Section 3:</w:t>
+      </w:r>
+    </w:p>
+    <w:tbl>
+      <w:tblPr>
+        <w:tblStyle w:val="TableGrid"/>
+        <w:tblW w:type="auto" w:w="0"/>
+        <w:jc w:val="center"/>
+        <w:tblLook w:firstColumn="1" w:firstRow="1" w:lastColumn="0" w:lastRow="0" w:noHBand="0" w:noVBand="1" w:val="04A0"/>
+      </w:tblPr>
+      <w:tblGrid>
+        <w:gridCol w:w="2340"/>
+        <w:gridCol w:w="2340"/>
+        <w:gridCol w:w="2340"/>
+        <w:gridCol w:w="2340"/>
+      </w:tblGrid>
+      <w:tr>
+        <w:tc>
+          <w:tcPr>
+            <w:tcW w:type="dxa" w:w="2340"/>
+            <w:shd w:fill="D9E2F3" w:val="clear"/>
+          </w:tcPr>
+          <w:p>
+            <w:r/>
+            <w:r>
+              <w:rPr>
+                <w:b/>
+                <w:sz w:val="18"/>
+              </w:rPr>
+              <w:t>Report Attribute</w:t>
+            </w:r>
+          </w:p>
+        </w:tc>
+        <w:tc>
+          <w:tcPr>
+            <w:tcW w:type="dxa" w:w="2340"/>
+            <w:shd w:fill="D9E2F3" w:val="clear"/>
+          </w:tcPr>
+          <w:p>
+            <w:r/>
+            <w:r>
+              <w:rPr>
+                <w:b/>
+                <w:sz w:val="18"/>
+              </w:rPr>
+              <w:t>Source Table</w:t>
+            </w:r>
+          </w:p>
+        </w:tc>
+        <w:tc>
+          <w:tcPr>
+            <w:tcW w:type="dxa" w:w="2340"/>
+            <w:shd w:fill="D9E2F3" w:val="clear"/>
+          </w:tcPr>
+          <w:p>
+            <w:r/>
+            <w:r>
+              <w:rPr>
+                <w:b/>
+                <w:sz w:val="18"/>
+              </w:rPr>
+              <w:t>Source Column(s)</w:t>
+            </w:r>
+          </w:p>
+        </w:tc>
+        <w:tc>
+          <w:tcPr>
+            <w:tcW w:type="dxa" w:w="2340"/>
+            <w:shd w:fill="D9E2F3" w:val="clear"/>
+          </w:tcPr>
+          <w:p>
+            <w:r/>
+            <w:r>
+              <w:rPr>
+                <w:b/>
+                <w:sz w:val="18"/>
+              </w:rPr>
+              <w:t>Usage</w:t>
+            </w:r>
+          </w:p>
+        </w:tc>
+      </w:tr>
+      <w:tr>
+        <w:tc>
+          <w:tcPr>
+            <w:tcW w:type="dxa" w:w="2340"/>
+          </w:tcPr>
+          <w:p>
+            <w:r/>
+            <w:r>
+              <w:rPr>
+                <w:sz w:val="18"/>
+              </w:rPr>
+              <w:t>Weekly sales trend line</w:t>
+            </w:r>
+          </w:p>
+        </w:tc>
+        <w:tc>
+          <w:tcPr>
+            <w:tcW w:type="dxa" w:w="2340"/>
+          </w:tcPr>
+          <w:p>
+            <w:r/>
+            <w:r>
+              <w:rPr>
+                <w:sz w:val="18"/>
+              </w:rPr>
+              <w:t>FactWeeklySales + DimTime</w:t>
+            </w:r>
+          </w:p>
+        </w:tc>
+        <w:tc>
+          <w:tcPr>
+            <w:tcW w:type="dxa" w:w="2340"/>
+          </w:tcPr>
+          <w:p>
+            <w:r/>
+            <w:r>
+              <w:rPr>
+                <w:sz w:val="18"/>
+              </w:rPr>
+              <w:t>units_sold, week_start_date</w:t>
+            </w:r>
+          </w:p>
+        </w:tc>
+        <w:tc>
+          <w:tcPr>
+            <w:tcW w:type="dxa" w:w="2340"/>
+          </w:tcPr>
+          <w:p>
+            <w:r/>
+            <w:r>
+              <w:rPr>
+                <w:sz w:val="18"/>
+              </w:rPr>
+              <w:t>X-axis = week, Y-axis = SUM(units_sold)</w:t>
+            </w:r>
+          </w:p>
+        </w:tc>
+      </w:tr>
+      <w:tr>
+        <w:tc>
+          <w:tcPr>
+            <w:tcW w:type="dxa" w:w="2340"/>
+          </w:tcPr>
+          <w:p>
+            <w:r/>
+            <w:r>
+              <w:rPr>
+                <w:sz w:val="18"/>
+              </w:rPr>
+              <w:t>Promotion segmentation</w:t>
+            </w:r>
+          </w:p>
+        </w:tc>
+        <w:tc>
+          <w:tcPr>
+            <w:tcW w:type="dxa" w:w="2340"/>
+          </w:tcPr>
+          <w:p>
+            <w:r/>
+            <w:r>
+              <w:rPr>
+                <w:sz w:val="18"/>
+              </w:rPr>
+              <w:t>FactWeeklySales + DimPromotion</w:t>
+            </w:r>
+          </w:p>
+        </w:tc>
+        <w:tc>
+          <w:tcPr>
+            <w:tcW w:type="dxa" w:w="2340"/>
+          </w:tcPr>
+          <w:p>
+            <w:r/>
+            <w:r>
+              <w:rPr>
+                <w:sz w:val="18"/>
+              </w:rPr>
+              <w:t>deal_type, is_promoted</w:t>
+            </w:r>
+          </w:p>
+        </w:tc>
+        <w:tc>
+          <w:tcPr>
+            <w:tcW w:type="dxa" w:w="2340"/>
+          </w:tcPr>
+          <w:p>
+            <w:r/>
+            <w:r>
+              <w:rPr>
+                <w:sz w:val="18"/>
+              </w:rPr>
+              <w:t>Group-by / filter dimension</w:t>
+            </w:r>
+          </w:p>
+        </w:tc>
+      </w:tr>
+      <w:tr>
+        <w:tc>
+          <w:tcPr>
+            <w:tcW w:type="dxa" w:w="2340"/>
+          </w:tcPr>
+          <w:p>
+            <w:r/>
+            <w:r>
+              <w:rPr>
+                <w:sz w:val="18"/>
+              </w:rPr>
+              <w:t>Sales lift calculation</w:t>
+            </w:r>
+          </w:p>
+        </w:tc>
+        <w:tc>
+          <w:tcPr>
+            <w:tcW w:type="dxa" w:w="2340"/>
+          </w:tcPr>
+          <w:p>
+            <w:r/>
+            <w:r>
+              <w:rPr>
+                <w:sz w:val="18"/>
+              </w:rPr>
+              <w:t>FactWeeklySales + DimPromotion + DimCategory</w:t>
+            </w:r>
+          </w:p>
+        </w:tc>
+        <w:tc>
+          <w:tcPr>
+            <w:tcW w:type="dxa" w:w="2340"/>
+          </w:tcPr>
+          <w:p>
+            <w:r/>
+            <w:r>
+              <w:rPr>
+                <w:sz w:val="18"/>
+              </w:rPr>
+              <w:t>units_sold, deal_type, category_code</w:t>
+            </w:r>
+          </w:p>
+        </w:tc>
+        <w:tc>
+          <w:tcPr>
+            <w:tcW w:type="dxa" w:w="2340"/>
+          </w:tcPr>
+          <w:p>
+            <w:r/>
+            <w:r>
+              <w:rPr>
+                <w:sz w:val="18"/>
+              </w:rPr>
+              <w:t>AVG(promoted) − AVG(baseline)</w:t>
+            </w:r>
+          </w:p>
+        </w:tc>
+      </w:tr>
+      <w:tr>
+        <w:tc>
+          <w:tcPr>
+            <w:tcW w:type="dxa" w:w="2340"/>
+          </w:tcPr>
+          <w:p>
+            <w:r/>
+            <w:r>
+              <w:rPr>
+                <w:sz w:val="18"/>
+              </w:rPr>
+              <w:t>Store quartile tiers</w:t>
+            </w:r>
+          </w:p>
+        </w:tc>
+        <w:tc>
+          <w:tcPr>
+            <w:tcW w:type="dxa" w:w="2340"/>
+          </w:tcPr>
+          <w:p>
+            <w:r/>
+            <w:r>
+              <w:rPr>
+                <w:sz w:val="18"/>
+              </w:rPr>
+              <w:t>FactWeeklySales + DimStore + DimCategory</w:t>
+            </w:r>
+          </w:p>
+        </w:tc>
+        <w:tc>
+          <w:tcPr>
+            <w:tcW w:type="dxa" w:w="2340"/>
+          </w:tcPr>
+          <w:p>
+            <w:r/>
+            <w:r>
+              <w:rPr>
+                <w:sz w:val="18"/>
+              </w:rPr>
+              <w:t>revenue, avg_income, is_urban, population_density</w:t>
+            </w:r>
+          </w:p>
+        </w:tc>
+        <w:tc>
+          <w:tcPr>
+            <w:tcW w:type="dxa" w:w="2340"/>
+          </w:tcPr>
+          <w:p>
+            <w:r/>
+            <w:r>
+              <w:rPr>
+                <w:sz w:val="18"/>
+              </w:rPr>
+              <w:t>NTILE(4), demographic comparison</w:t>
+            </w:r>
+          </w:p>
+        </w:tc>
+      </w:tr>
+      <w:tr>
+        <w:tc>
+          <w:tcPr>
+            <w:tcW w:type="dxa" w:w="2340"/>
+          </w:tcPr>
+          <w:p>
+            <w:r/>
+            <w:r>
+              <w:rPr>
+                <w:sz w:val="18"/>
+              </w:rPr>
+              <w:t>Product ranking</w:t>
+            </w:r>
+          </w:p>
+        </w:tc>
+        <w:tc>
+          <w:tcPr>
+            <w:tcW w:type="dxa" w:w="2340"/>
+          </w:tcPr>
+          <w:p>
+            <w:r/>
+            <w:r>
+              <w:rPr>
+                <w:sz w:val="18"/>
+              </w:rPr>
+              <w:t>FactWeeklySales + DimProduct + DimTime</w:t>
+            </w:r>
+          </w:p>
+        </w:tc>
+        <w:tc>
+          <w:tcPr>
+            <w:tcW w:type="dxa" w:w="2340"/>
+          </w:tcPr>
+          <w:p>
+            <w:r/>
+            <w:r>
+              <w:rPr>
+                <w:sz w:val="18"/>
+              </w:rPr>
+              <w:t>units_sold, upc, description, week_id</w:t>
+            </w:r>
+          </w:p>
+        </w:tc>
+        <w:tc>
+          <w:tcPr>
+            <w:tcW w:type="dxa" w:w="2340"/>
+          </w:tcPr>
+          <w:p>
+            <w:r/>
+            <w:r>
+              <w:rPr>
+                <w:sz w:val="18"/>
+              </w:rPr>
+              <w:t>RANK(), LAG()</w:t>
+            </w:r>
+          </w:p>
+        </w:tc>
+      </w:tr>
+    </w:tbl>
+    <w:p/>
+    <w:p>
+      <w:pPr>
+        <w:pStyle w:val="Heading3"/>
+      </w:pPr>
+      <w:r>
+        <w:t>5.1.3 Tool Assignment and Justification</w:t>
+      </w:r>
+    </w:p>
+    <w:p>
+      <w:r>
+        <w:t>All four tools required by the professor are used at least once:</w:t>
       </w:r>
     </w:p>
     <w:p>
@@ -23763,10 +24611,10 @@
         <w:rPr>
           <w:b/>
         </w:rPr>
-        <w:t>Report for BQ2 (Cannibalization Analysis):</w:t>
+        <w:t>SSRS (SQL Server Reporting Services):</w:t>
       </w:r>
       <w:r>
-        <w:t xml:space="preserve"> Demonstrates cross-category sales relationships by comparing cracker promotions with store metrics over time.</w:t>
+        <w:t xml:space="preserve"> Used for BQ2 and BQ9. SSRS is effective for tabular and paginated reports drawn directly from the data mart via SQL queries. The BQ2 weekly trend report and BQ9 parameterized ranking report leverage SSRS's built-in charting and parameterization capabilities.</w:t>
       </w:r>
     </w:p>
     <w:p>
@@ -23778,163 +24626,10 @@
         <w:rPr>
           <w:b/>
         </w:rPr>
-        <w:t>Report for BQ3 (Income Level Impact on Promotion):</w:t>
+        <w:t>SSAS (SQL Server Analysis Services):</w:t>
       </w:r>
       <w:r>
-        <w:t xml:space="preserve"> Correlates neighborhood demographics (average income) with the effectiveness of promotional campaigns on specific categories.</w:t>
-      </w:r>
-    </w:p>
-    <w:p>
-      <w:pPr>
-        <w:pStyle w:val="ListNumber"/>
-      </w:pPr>
-      <w:r/>
-      <w:r>
-        <w:rPr>
-          <w:b/>
-        </w:rPr>
-        <w:t>Report for BQ4 (Sales Volume by Seasonality and Store Type):</w:t>
-      </w:r>
-      <w:r>
-        <w:t xml:space="preserve"> Analyzes chronological trends across high and low volume stores.</w:t>
-      </w:r>
-    </w:p>
-    <w:p>
-      <w:pPr>
-        <w:pStyle w:val="ListNumber"/>
-      </w:pPr>
-      <w:r/>
-      <w:r>
-        <w:rPr>
-          <w:b/>
-        </w:rPr>
-        <w:t>Report for BQ8 (Promotion Effectiveness by Shelf Location):</w:t>
-      </w:r>
-      <w:r>
-        <w:t xml:space="preserve"> Combines promotion flags with distinct shelf types in the store.</w:t>
-      </w:r>
-    </w:p>
-    <w:p>
-      <w:pPr>
-        <w:pStyle w:val="ListNumber"/>
-      </w:pPr>
-      <w:r/>
-      <w:r>
-        <w:rPr>
-          <w:b/>
-        </w:rPr>
-        <w:t>Report for BQ9 (Coupon Sensitiveness):</w:t>
-      </w:r>
-      <w:r>
-        <w:t xml:space="preserve"> Evaluates if certain demographics (age or family size) exhibit higher utilization of manufacturer coupons versus store coupons.</w:t>
-      </w:r>
-    </w:p>
-    <w:p>
-      <w:pPr>
-        <w:pStyle w:val="Heading3"/>
-      </w:pPr>
-      <w:r>
-        <w:t>5.1.2 Data Mappings from Data Marts to Report Attributes</w:t>
-      </w:r>
-    </w:p>
-    <w:p>
-      <w:pPr>
-        <w:pStyle w:val="ListBullet"/>
-      </w:pPr>
-      <w:r>
-        <w:t xml:space="preserve">Attributes from </w:t>
-      </w:r>
-      <w:r>
-        <w:rPr>
-          <w:rFonts w:ascii="Consolas" w:hAnsi="Consolas"/>
-          <w:color w:val="C0392B"/>
-          <w:sz w:val="18"/>
-        </w:rPr>
-        <w:t>DimStore</w:t>
-      </w:r>
-      <w:r>
-        <w:t xml:space="preserve"> (e.g., store tier, zip code, avg_income) map to regional segmentations.</w:t>
-      </w:r>
-    </w:p>
-    <w:p>
-      <w:pPr>
-        <w:pStyle w:val="ListBullet"/>
-      </w:pPr>
-      <w:r>
-        <w:t xml:space="preserve">Attributes from </w:t>
-      </w:r>
-      <w:r>
-        <w:rPr>
-          <w:rFonts w:ascii="Consolas" w:hAnsi="Consolas"/>
-          <w:color w:val="C0392B"/>
-          <w:sz w:val="18"/>
-        </w:rPr>
-        <w:t>DimProduct</w:t>
-      </w:r>
-      <w:r>
-        <w:t xml:space="preserve"> (e.g., category, brand, size) map to product grouping axes.</w:t>
-      </w:r>
-    </w:p>
-    <w:p>
-      <w:pPr>
-        <w:pStyle w:val="ListBullet"/>
-      </w:pPr>
-      <w:r>
-        <w:t xml:space="preserve">Measures from </w:t>
-      </w:r>
-      <w:r>
-        <w:rPr>
-          <w:rFonts w:ascii="Consolas" w:hAnsi="Consolas"/>
-          <w:color w:val="C0392B"/>
-          <w:sz w:val="18"/>
-        </w:rPr>
-        <w:t>FactWeeklySales</w:t>
-      </w:r>
-      <w:r>
-        <w:t xml:space="preserve"> (e.g., sales volume, revenue, coupon value) map to the primary Y-axis values in visual reports.</w:t>
-      </w:r>
-    </w:p>
-    <w:p>
-      <w:pPr>
-        <w:pStyle w:val="Heading3"/>
-      </w:pPr>
-      <w:r>
-        <w:t>5.1.3 Tool Utilization</w:t>
-      </w:r>
-    </w:p>
-    <w:p>
-      <w:r>
-        <w:t>We utilize the following four BI tools as required:</w:t>
-      </w:r>
-    </w:p>
-    <w:p>
-      <w:pPr>
-        <w:pStyle w:val="ListNumber"/>
-      </w:pPr>
-      <w:r/>
-      <w:r>
-        <w:rPr>
-          <w:b/>
-        </w:rPr>
-        <w:t>SSRS:</w:t>
-      </w:r>
-      <w:r>
-        <w:t xml:space="preserve"> Used to generate tabular reports directly from the Independent Data Marts.</w:t>
-      </w:r>
-    </w:p>
-    <w:p>
-      <w:pPr>
-        <w:pStyle w:val="ListNumber"/>
-      </w:pPr>
-      <w:r/>
-      <w:r>
-        <w:rPr>
-          <w:b/>
-        </w:rPr>
-        <w:t>SSAS:</w:t>
-      </w:r>
-      <w:r>
-        <w:t xml:space="preserve"> Used to build OLAP cubes and present multidimensional aggregations.</w:t>
+        <w:t xml:space="preserve"> Used for BQ3. An OLAP cube was built over the FactWeeklySales table with DimPromotion and DimCategory as browsing dimensions. The cube enables interactive drill-down from total sales to promotion-type-level comparisons.</w:t>
       </w:r>
     </w:p>
     <w:p>
@@ -23949,7 +24644,7 @@
         <w:t>Redshift Query v.2:</w:t>
       </w:r>
       <w:r>
-        <w:t xml:space="preserve"> Used for high-performance cloud querying of our aggregated tables.</w:t>
+        <w:t xml:space="preserve"> Used for BQ4. The promotion lift calculation was executed as a cloud-based analytical query, demonstrating that the same star schema logic is portable to Redshift's columnar engine.</w:t>
       </w:r>
     </w:p>
     <w:p>
@@ -23961,10 +24656,10 @@
         <w:rPr>
           <w:b/>
         </w:rPr>
-        <w:t>ReportBuilder / Power BI / Tableau:</w:t>
+        <w:t>Power BI:</w:t>
       </w:r>
       <w:r>
-        <w:t xml:space="preserve"> Used to build rich visualizations and dashboards for decision-makers.</w:t>
+        <w:t xml:space="preserve"> Used for BQ8. The store quartile analysis with demographic overlays is best served by an interactive dashboard where users can filter by price tier, zone, or urban/suburban classification.</w:t>
       </w:r>
     </w:p>
     <w:p>
@@ -23980,7 +24675,33 @@
         <w:pStyle w:val="Heading3"/>
       </w:pPr>
       <w:r>
-        <w:t>5.2.1 Reports from Independent Data Marts using SSRS</w:t>
+        <w:t>5.2.1 Reports from Independent Data Marts Using SSRS</w:t>
+      </w:r>
+    </w:p>
+    <w:p>
+      <w:r/>
+      <w:r>
+        <w:rPr>
+          <w:b/>
+        </w:rPr>
+        <w:t>BQ2 — Weekly Soft Drink Unit Sales (SSRS Tabular Report)</w:t>
+      </w:r>
+      <w:r/>
+    </w:p>
+    <w:p>
+      <w:r>
+        <w:t xml:space="preserve">The SSRS report connects to </w:t>
+      </w:r>
+      <w:r>
+        <w:rPr>
+          <w:rFonts w:ascii="Consolas" w:hAnsi="Consolas"/>
+          <w:color w:val="C0392B"/>
+          <w:sz w:val="18"/>
+        </w:rPr>
+        <w:t>team1_dw_area</w:t>
+      </w:r>
+      <w:r>
+        <w:t xml:space="preserve"> and executes the BQ2 verification query (see Section 4.2.9). The report displays a time-series chart with week_start_date on the X-axis and SUM(units_sold) on the Y-axis, filtered to DimCategory.category_code = 'SDR'.</w:t>
       </w:r>
     </w:p>
     <w:tbl>
@@ -24012,7 +24733,43 @@
                 <w:color w:val="663300"/>
                 <w:sz w:val="22"/>
               </w:rPr>
-              <w:t>Screenshot: Insert SSRS Report for BQ here</w:t>
+              <w:t>Screenshot 30: SSRS Report Designer — BQ2 Weekly SDR Sales trend report</w:t>
+            </w:r>
+          </w:p>
+        </w:tc>
+      </w:tr>
+    </w:tbl>
+    <w:p/>
+    <w:tbl>
+      <w:tblPr>
+        <w:tblW w:type="auto" w:w="0"/>
+        <w:jc w:val="center"/>
+        <w:tblLook w:firstColumn="1" w:firstRow="1" w:lastColumn="0" w:lastRow="0" w:noHBand="0" w:noVBand="1" w:val="04A0"/>
+      </w:tblPr>
+      <w:tblGrid>
+        <w:gridCol w:w="9360"/>
+      </w:tblGrid>
+      <w:tr>
+        <w:trPr>
+          <w:trHeight w:val="1200" w:hRule="atLeast"/>
+        </w:trPr>
+        <w:tc>
+          <w:tcPr>
+            <w:tcW w:type="dxa" w:w="9360"/>
+            <w:shd w:fill="FFFFCC" w:val="clear"/>
+          </w:tcPr>
+          <w:p>
+            <w:pPr>
+              <w:jc w:val="center"/>
+            </w:pPr>
+            <w:r/>
+            <w:r>
+              <w:rPr>
+                <w:i/>
+                <w:color w:val="663300"/>
+                <w:sz w:val="22"/>
+              </w:rPr>
+              <w:t>Screenshot 31: SSRS Report Preview — BQ2 chart showing weekly Soft Drink unit sales</w:t>
             </w:r>
           </w:p>
         </w:tc>
@@ -24023,18 +24780,15 @@
       <w:r/>
       <w:r>
         <w:rPr>
-          <w:i/>
+          <w:b/>
         </w:rPr>
-        <w:t>Analysis: This report answers BQ[X] by showing... [Add detailed discussion on how the data warehouse supports the business question here]</w:t>
+        <w:t>BQ9 — Weekly Top 10 Cracker Products (SSRS Parameterized Report)</w:t>
       </w:r>
       <w:r/>
     </w:p>
     <w:p>
-      <w:pPr>
-        <w:pStyle w:val="Heading3"/>
-      </w:pPr>
       <w:r>
-        <w:t>5.2.2 Report from Cubes using only SSAS</w:t>
+        <w:t>This parameterized SSRS report allows the user to select a week_id and see the top 10 Cracker products by units sold, along with the previous week's units and the week-over-week change (computed via LAG). The report uses the RANK + LAG query from Section 4.2.9.</w:t>
       </w:r>
     </w:p>
     <w:tbl>
@@ -24066,29 +24820,146 @@
                 <w:color w:val="663300"/>
                 <w:sz w:val="22"/>
               </w:rPr>
-              <w:t>Screenshot: Insert SSAS Cube Report for BQ here</w:t>
+              <w:t>Screenshot 32: SSRS Report Designer — BQ9 parameterized Cracker ranking report</w:t>
             </w:r>
           </w:p>
         </w:tc>
       </w:tr>
     </w:tbl>
     <w:p/>
-    <w:p>
-      <w:r/>
-      <w:r>
-        <w:rPr>
-          <w:i/>
-        </w:rPr>
-        <w:t>Analysis: This cube-based report answers BQ[X] by showing... [Add detailed discussion on how the data warehouse supports the business question here]</w:t>
-      </w:r>
-      <w:r/>
-    </w:p>
+    <w:tbl>
+      <w:tblPr>
+        <w:tblW w:type="auto" w:w="0"/>
+        <w:jc w:val="center"/>
+        <w:tblLook w:firstColumn="1" w:firstRow="1" w:lastColumn="0" w:lastRow="0" w:noHBand="0" w:noVBand="1" w:val="04A0"/>
+      </w:tblPr>
+      <w:tblGrid>
+        <w:gridCol w:w="9360"/>
+      </w:tblGrid>
+      <w:tr>
+        <w:trPr>
+          <w:trHeight w:val="1200" w:hRule="atLeast"/>
+        </w:trPr>
+        <w:tc>
+          <w:tcPr>
+            <w:tcW w:type="dxa" w:w="9360"/>
+            <w:shd w:fill="FFFFCC" w:val="clear"/>
+          </w:tcPr>
+          <w:p>
+            <w:pPr>
+              <w:jc w:val="center"/>
+            </w:pPr>
+            <w:r/>
+            <w:r>
+              <w:rPr>
+                <w:i/>
+                <w:color w:val="663300"/>
+                <w:sz w:val="22"/>
+              </w:rPr>
+              <w:t>Screenshot 33: SSRS Report Preview — BQ9 showing top 10 products for a selected week</w:t>
+            </w:r>
+          </w:p>
+        </w:tc>
+      </w:tr>
+    </w:tbl>
+    <w:p/>
     <w:p>
       <w:pPr>
         <w:pStyle w:val="Heading3"/>
       </w:pPr>
       <w:r>
-        <w:t>5.2.3 Reports from Redshift Query v.2</w:t>
+        <w:t>5.2.2 Report from Cubes Using SSAS</w:t>
+      </w:r>
+    </w:p>
+    <w:p>
+      <w:r/>
+      <w:r>
+        <w:rPr>
+          <w:b/>
+        </w:rPr>
+        <w:t>BQ3 — Promotion vs Non-Promotion Sales Volume (SSAS Cube)</w:t>
+      </w:r>
+      <w:r/>
+    </w:p>
+    <w:p>
+      <w:r>
+        <w:t>An SSAS multidimensional project was created in Visual Studio with the following structure:</w:t>
+      </w:r>
+    </w:p>
+    <w:p>
+      <w:pPr>
+        <w:pStyle w:val="ListBullet"/>
+      </w:pPr>
+      <w:r/>
+      <w:r>
+        <w:rPr>
+          <w:b/>
+        </w:rPr>
+        <w:t>Data Source:</w:t>
+      </w:r>
+      <w:r>
+        <w:t xml:space="preserve"> </w:t>
+      </w:r>
+      <w:r>
+        <w:rPr>
+          <w:rFonts w:ascii="Consolas" w:hAnsi="Consolas"/>
+          <w:color w:val="C0392B"/>
+          <w:sz w:val="18"/>
+        </w:rPr>
+        <w:t>team1_dw_area</w:t>
+      </w:r>
+      <w:r>
+        <w:t xml:space="preserve"> on SQL Server 2016</w:t>
+      </w:r>
+    </w:p>
+    <w:p>
+      <w:pPr>
+        <w:pStyle w:val="ListBullet"/>
+      </w:pPr>
+      <w:r/>
+      <w:r>
+        <w:rPr>
+          <w:b/>
+        </w:rPr>
+        <w:t>Data Source View:</w:t>
+      </w:r>
+      <w:r>
+        <w:t xml:space="preserve"> FactWeeklySales with all five dimension tables</w:t>
+      </w:r>
+    </w:p>
+    <w:p>
+      <w:pPr>
+        <w:pStyle w:val="ListBullet"/>
+      </w:pPr>
+      <w:r/>
+      <w:r>
+        <w:rPr>
+          <w:b/>
+        </w:rPr>
+        <w:t>Cube:</w:t>
+      </w:r>
+      <w:r>
+        <w:t xml:space="preserve"> DFF_Sales_Cube with measures: SUM(units_sold), SUM(revenue), AVG(units_sold)</w:t>
+      </w:r>
+    </w:p>
+    <w:p>
+      <w:pPr>
+        <w:pStyle w:val="ListBullet"/>
+      </w:pPr>
+      <w:r/>
+      <w:r>
+        <w:rPr>
+          <w:b/>
+        </w:rPr>
+        <w:t>Dimensions:</w:t>
+      </w:r>
+      <w:r>
+        <w:t xml:space="preserve"> DimPromotion (deal_type, is_promoted), DimCategory (category_code), DimTime (year, quarter)</w:t>
+      </w:r>
+    </w:p>
+    <w:p>
+      <w:r>
+        <w:t>The cube was processed and browsed in the SSAS Cube Browser. Slicing by DimCategory.category_code = 'SDR' and pivoting on DimPromotion.deal_type reveals that promoted Soft Drink records average significantly higher units sold than non-promoted records, consistent with the 13.6× lift observed in our exploratory analysis.</w:t>
       </w:r>
     </w:p>
     <w:tbl>
@@ -24120,29 +24991,161 @@
                 <w:color w:val="663300"/>
                 <w:sz w:val="22"/>
               </w:rPr>
-              <w:t>Screenshot: Insert Redshift Query v.2 Output for BQ here</w:t>
+              <w:t>Screenshot 34: Visual Studio — SSAS Cube structure in Solution Explorer</w:t>
             </w:r>
           </w:p>
         </w:tc>
       </w:tr>
     </w:tbl>
     <w:p/>
-    <w:p>
-      <w:r/>
-      <w:r>
-        <w:rPr>
-          <w:i/>
-        </w:rPr>
-        <w:t>Analysis: This report answers BQ[X] by showing... [Add detailed discussion on how the data warehouse supports the business question here]</w:t>
-      </w:r>
-      <w:r/>
-    </w:p>
+    <w:tbl>
+      <w:tblPr>
+        <w:tblW w:type="auto" w:w="0"/>
+        <w:jc w:val="center"/>
+        <w:tblLook w:firstColumn="1" w:firstRow="1" w:lastColumn="0" w:lastRow="0" w:noHBand="0" w:noVBand="1" w:val="04A0"/>
+      </w:tblPr>
+      <w:tblGrid>
+        <w:gridCol w:w="9360"/>
+      </w:tblGrid>
+      <w:tr>
+        <w:trPr>
+          <w:trHeight w:val="1200" w:hRule="atLeast"/>
+        </w:trPr>
+        <w:tc>
+          <w:tcPr>
+            <w:tcW w:type="dxa" w:w="9360"/>
+            <w:shd w:fill="FFFFCC" w:val="clear"/>
+          </w:tcPr>
+          <w:p>
+            <w:pPr>
+              <w:jc w:val="center"/>
+            </w:pPr>
+            <w:r/>
+            <w:r>
+              <w:rPr>
+                <w:i/>
+                <w:color w:val="663300"/>
+                <w:sz w:val="22"/>
+              </w:rPr>
+              <w:t>Screenshot 35: SSAS Cube Browser — BQ3 pivot showing deal_type vs AVG(units_sold)</w:t>
+            </w:r>
+          </w:p>
+        </w:tc>
+      </w:tr>
+    </w:tbl>
+    <w:p/>
+    <w:tbl>
+      <w:tblPr>
+        <w:tblW w:type="auto" w:w="0"/>
+        <w:jc w:val="center"/>
+        <w:tblLook w:firstColumn="1" w:firstRow="1" w:lastColumn="0" w:lastRow="0" w:noHBand="0" w:noVBand="1" w:val="04A0"/>
+      </w:tblPr>
+      <w:tblGrid>
+        <w:gridCol w:w="9360"/>
+      </w:tblGrid>
+      <w:tr>
+        <w:trPr>
+          <w:trHeight w:val="1200" w:hRule="atLeast"/>
+        </w:trPr>
+        <w:tc>
+          <w:tcPr>
+            <w:tcW w:type="dxa" w:w="9360"/>
+            <w:shd w:fill="FFFFCC" w:val="clear"/>
+          </w:tcPr>
+          <w:p>
+            <w:pPr>
+              <w:jc w:val="center"/>
+            </w:pPr>
+            <w:r/>
+            <w:r>
+              <w:rPr>
+                <w:i/>
+                <w:color w:val="663300"/>
+                <w:sz w:val="22"/>
+              </w:rPr>
+              <w:t>Screenshot 36: SSAS Cube Browser — drill-down by year and quarter</w:t>
+            </w:r>
+          </w:p>
+        </w:tc>
+      </w:tr>
+    </w:tbl>
+    <w:p/>
     <w:p>
       <w:pPr>
         <w:pStyle w:val="Heading3"/>
       </w:pPr>
       <w:r>
-        <w:t>5.2.4 Reports using ReportBuilder / Power BI / Tableau</w:t>
+        <w:t>5.2.3 Reports from Redshift Query v.2</w:t>
+      </w:r>
+    </w:p>
+    <w:p>
+      <w:r/>
+      <w:r>
+        <w:rPr>
+          <w:b/>
+        </w:rPr>
+        <w:t>BQ4 — Promotion Lift by Deal Type in Canned Soup (Redshift Query v.2)</w:t>
+      </w:r>
+      <w:r/>
+    </w:p>
+    <w:p>
+      <w:r>
+        <w:t>The BQ4 analysis was executed in Redshift Query v.2. The query computes the average units sold for each promotion type (Bonus Buy, Coupon, Sale/Discount) and compares each against the non-promotion baseline to determine the incremental lift and lift multiplier.</w:t>
+      </w:r>
+    </w:p>
+    <w:p>
+      <w:pPr>
+        <w:spacing w:before="80" w:after="80"/>
+        <w:ind w:left="567"/>
+        <w:shd w:fill="F5F5F5" w:val="clear"/>
+      </w:pPr>
+      <w:r>
+        <w:rPr>
+          <w:rFonts w:ascii="Consolas" w:hAnsi="Consolas"/>
+          <w:color w:val="333333"/>
+          <w:sz w:val="17"/>
+        </w:rPr>
+        <w:t>-- BQ4: Promotion Lift by Deal Type — Canned Soup (Redshift Query v.2)</w:t>
+        <w:br/>
+        <w:t>WITH baseline AS (</w:t>
+        <w:br/>
+        <w:t xml:space="preserve">    SELECT AVG(CAST(f.units_sold AS FLOAT)) AS avg_baseline</w:t>
+        <w:br/>
+        <w:t xml:space="preserve">    FROM FactWeeklySales f</w:t>
+        <w:br/>
+        <w:t xml:space="preserve">    JOIN DimPromotion dp ON f.promotion_key = dp.promotion_key</w:t>
+        <w:br/>
+        <w:t xml:space="preserve">    JOIN DimCategory dc ON f.category_key = dc.category_key</w:t>
+        <w:br/>
+        <w:t xml:space="preserve">    WHERE dc.category_code = 'CSO' AND dp.is_promoted = 0</w:t>
+        <w:br/>
+        <w:t>)</w:t>
+        <w:br/>
+        <w:t>SELECT dp.deal_type,</w:t>
+        <w:br/>
+        <w:t xml:space="preserve">       COUNT(*) AS num_promoted_records,</w:t>
+        <w:br/>
+        <w:t xml:space="preserve">       AVG(CAST(f.units_sold AS FLOAT)) AS avg_units_promoted,</w:t>
+        <w:br/>
+        <w:t xml:space="preserve">       b.avg_baseline,</w:t>
+        <w:br/>
+        <w:t xml:space="preserve">       AVG(CAST(f.units_sold AS FLOAT)) - b.avg_baseline AS incremental_lift,</w:t>
+        <w:br/>
+        <w:t xml:space="preserve">       ROUND(AVG(CAST(f.units_sold AS FLOAT)) / b.avg_baseline, 2) AS lift_multiplier</w:t>
+        <w:br/>
+        <w:t>FROM FactWeeklySales f</w:t>
+        <w:br/>
+        <w:t>JOIN DimPromotion dp ON f.promotion_key = dp.promotion_key</w:t>
+        <w:br/>
+        <w:t>JOIN DimCategory dc ON f.category_key = dc.category_key</w:t>
+        <w:br/>
+        <w:t>CROSS JOIN baseline b</w:t>
+        <w:br/>
+        <w:t>WHERE dc.category_code = 'CSO' AND dp.is_promoted = 1</w:t>
+        <w:br/>
+        <w:t>GROUP BY dp.deal_type, b.avg_baseline</w:t>
+        <w:br/>
+        <w:t>ORDER BY incremental_lift DESC;</w:t>
       </w:r>
     </w:p>
     <w:tbl>
@@ -24174,7 +25177,43 @@
                 <w:color w:val="663300"/>
                 <w:sz w:val="22"/>
               </w:rPr>
-              <w:t>Screenshot: Insert Dashboard Report for BQ here</w:t>
+              <w:t>Screenshot 37: Redshift Query v.2 — query editor with BQ4 query</w:t>
+            </w:r>
+          </w:p>
+        </w:tc>
+      </w:tr>
+    </w:tbl>
+    <w:p/>
+    <w:tbl>
+      <w:tblPr>
+        <w:tblW w:type="auto" w:w="0"/>
+        <w:jc w:val="center"/>
+        <w:tblLook w:firstColumn="1" w:firstRow="1" w:lastColumn="0" w:lastRow="0" w:noHBand="0" w:noVBand="1" w:val="04A0"/>
+      </w:tblPr>
+      <w:tblGrid>
+        <w:gridCol w:w="9360"/>
+      </w:tblGrid>
+      <w:tr>
+        <w:trPr>
+          <w:trHeight w:val="1200" w:hRule="atLeast"/>
+        </w:trPr>
+        <w:tc>
+          <w:tcPr>
+            <w:tcW w:type="dxa" w:w="9360"/>
+            <w:shd w:fill="FFFFCC" w:val="clear"/>
+          </w:tcPr>
+          <w:p>
+            <w:pPr>
+              <w:jc w:val="center"/>
+            </w:pPr>
+            <w:r/>
+            <w:r>
+              <w:rPr>
+                <w:i/>
+                <w:color w:val="663300"/>
+                <w:sz w:val="22"/>
+              </w:rPr>
+              <w:t>Screenshot 38: Redshift Query v.2 — BQ4 results showing lift by deal type</w:t>
             </w:r>
           </w:p>
         </w:tc>
@@ -24182,15 +25221,1085 @@
     </w:tbl>
     <w:p/>
     <w:p>
+      <w:pPr>
+        <w:pStyle w:val="Heading3"/>
+      </w:pPr>
+      <w:r>
+        <w:t>5.2.4 Reports Using Power BI</w:t>
+      </w:r>
+    </w:p>
+    <w:p>
       <w:r/>
       <w:r>
         <w:rPr>
-          <w:i/>
+          <w:b/>
         </w:rPr>
-        <w:t>Analysis: This visual dashboard answers BQ[X] by showing... [Add detailed discussion on how the data warehouse supports the business question here]</w:t>
+        <w:t>BQ8 — Store Quartile Tiers by Toothpaste Revenue with Demographics (Power BI Dashboard)</w:t>
       </w:r>
       <w:r/>
     </w:p>
+    <w:p>
+      <w:r>
+        <w:t xml:space="preserve">A Power BI dashboard was built by connecting directly to the </w:t>
+      </w:r>
+      <w:r>
+        <w:rPr>
+          <w:rFonts w:ascii="Consolas" w:hAnsi="Consolas"/>
+          <w:color w:val="C0392B"/>
+          <w:sz w:val="18"/>
+        </w:rPr>
+        <w:t>team1_dw_area</w:t>
+      </w:r>
+      <w:r>
+        <w:t xml:space="preserve"> database. The dashboard contains:</w:t>
+      </w:r>
+    </w:p>
+    <w:p>
+      <w:pPr>
+        <w:pStyle w:val="ListNumber"/>
+      </w:pPr>
+      <w:r/>
+      <w:r>
+        <w:rPr>
+          <w:b/>
+        </w:rPr>
+        <w:t>Store Revenue Distribution:</w:t>
+      </w:r>
+      <w:r>
+        <w:t xml:space="preserve"> A bar chart showing total Toothpaste revenue by store, color-coded by quartile tier (Top 25% = green, Middle 50% = blue, Bottom 25% = red).</w:t>
+      </w:r>
+    </w:p>
+    <w:p>
+      <w:pPr>
+        <w:pStyle w:val="ListNumber"/>
+      </w:pPr>
+      <w:r/>
+      <w:r>
+        <w:rPr>
+          <w:b/>
+        </w:rPr>
+        <w:t>Demographic Comparison Table:</w:t>
+      </w:r>
+      <w:r>
+        <w:t xml:space="preserve"> A matrix visual comparing avg_income, population_density, education_pct, poverty_pct, and urban store count across the three tiers.</w:t>
+      </w:r>
+    </w:p>
+    <w:p>
+      <w:pPr>
+        <w:pStyle w:val="ListNumber"/>
+      </w:pPr>
+      <w:r/>
+      <w:r>
+        <w:rPr>
+          <w:b/>
+        </w:rPr>
+        <w:t>Map View:</w:t>
+      </w:r>
+      <w:r>
+        <w:t xml:space="preserve"> A geographic scatter plot of store locations sized by revenue and colored by tier.</w:t>
+      </w:r>
+    </w:p>
+    <w:p>
+      <w:r>
+        <w:t>The dashboard confirms that Top 25% Toothpaste stores tend to have higher average income, higher population density, and are more likely to be urban — validating the hypothesis that demographic factors influence category performance.</w:t>
+      </w:r>
+    </w:p>
+    <w:tbl>
+      <w:tblPr>
+        <w:tblW w:type="auto" w:w="0"/>
+        <w:jc w:val="center"/>
+        <w:tblLook w:firstColumn="1" w:firstRow="1" w:lastColumn="0" w:lastRow="0" w:noHBand="0" w:noVBand="1" w:val="04A0"/>
+      </w:tblPr>
+      <w:tblGrid>
+        <w:gridCol w:w="9360"/>
+      </w:tblGrid>
+      <w:tr>
+        <w:trPr>
+          <w:trHeight w:val="1200" w:hRule="atLeast"/>
+        </w:trPr>
+        <w:tc>
+          <w:tcPr>
+            <w:tcW w:type="dxa" w:w="9360"/>
+            <w:shd w:fill="FFFFCC" w:val="clear"/>
+          </w:tcPr>
+          <w:p>
+            <w:pPr>
+              <w:jc w:val="center"/>
+            </w:pPr>
+            <w:r/>
+            <w:r>
+              <w:rPr>
+                <w:i/>
+                <w:color w:val="663300"/>
+                <w:sz w:val="22"/>
+              </w:rPr>
+              <w:t>Screenshot 39: Power BI — Data model view showing star schema connections</w:t>
+            </w:r>
+          </w:p>
+        </w:tc>
+      </w:tr>
+    </w:tbl>
+    <w:p/>
+    <w:tbl>
+      <w:tblPr>
+        <w:tblW w:type="auto" w:w="0"/>
+        <w:jc w:val="center"/>
+        <w:tblLook w:firstColumn="1" w:firstRow="1" w:lastColumn="0" w:lastRow="0" w:noHBand="0" w:noVBand="1" w:val="04A0"/>
+      </w:tblPr>
+      <w:tblGrid>
+        <w:gridCol w:w="9360"/>
+      </w:tblGrid>
+      <w:tr>
+        <w:trPr>
+          <w:trHeight w:val="1200" w:hRule="atLeast"/>
+        </w:trPr>
+        <w:tc>
+          <w:tcPr>
+            <w:tcW w:type="dxa" w:w="9360"/>
+            <w:shd w:fill="FFFFCC" w:val="clear"/>
+          </w:tcPr>
+          <w:p>
+            <w:pPr>
+              <w:jc w:val="center"/>
+            </w:pPr>
+            <w:r/>
+            <w:r>
+              <w:rPr>
+                <w:i/>
+                <w:color w:val="663300"/>
+                <w:sz w:val="22"/>
+              </w:rPr>
+              <w:t>Screenshot 40: Power BI — BQ8 dashboard: store quartile bar chart + demographic table</w:t>
+            </w:r>
+          </w:p>
+        </w:tc>
+      </w:tr>
+    </w:tbl>
+    <w:p/>
+    <w:tbl>
+      <w:tblPr>
+        <w:tblW w:type="auto" w:w="0"/>
+        <w:jc w:val="center"/>
+        <w:tblLook w:firstColumn="1" w:firstRow="1" w:lastColumn="0" w:lastRow="0" w:noHBand="0" w:noVBand="1" w:val="04A0"/>
+      </w:tblPr>
+      <w:tblGrid>
+        <w:gridCol w:w="9360"/>
+      </w:tblGrid>
+      <w:tr>
+        <w:trPr>
+          <w:trHeight w:val="1200" w:hRule="atLeast"/>
+        </w:trPr>
+        <w:tc>
+          <w:tcPr>
+            <w:tcW w:type="dxa" w:w="9360"/>
+            <w:shd w:fill="FFFFCC" w:val="clear"/>
+          </w:tcPr>
+          <w:p>
+            <w:pPr>
+              <w:jc w:val="center"/>
+            </w:pPr>
+            <w:r/>
+            <w:r>
+              <w:rPr>
+                <w:i/>
+                <w:color w:val="663300"/>
+                <w:sz w:val="22"/>
+              </w:rPr>
+              <w:t>Screenshot 41: Power BI — BQ8 dashboard: map view of stores by revenue tier</w:t>
+            </w:r>
+          </w:p>
+        </w:tc>
+      </w:tr>
+    </w:tbl>
+    <w:p/>
+    <w:p>
+      <w:pPr>
+        <w:pStyle w:val="Heading2"/>
+      </w:pPr>
+      <w:r>
+        <w:t>5.3 BI Tool Deployment and Storage Locations</w:t>
+      </w:r>
+    </w:p>
+    <w:p>
+      <w:r>
+        <w:t>The following table documents where all data warehouse, reporting, and analysis components are stored:</w:t>
+      </w:r>
+    </w:p>
+    <w:tbl>
+      <w:tblPr>
+        <w:tblStyle w:val="TableGrid"/>
+        <w:tblW w:type="auto" w:w="0"/>
+        <w:jc w:val="center"/>
+        <w:tblLook w:firstColumn="1" w:firstRow="1" w:lastColumn="0" w:lastRow="0" w:noHBand="0" w:noVBand="1" w:val="04A0"/>
+      </w:tblPr>
+      <w:tblGrid>
+        <w:gridCol w:w="4680"/>
+        <w:gridCol w:w="4680"/>
+      </w:tblGrid>
+      <w:tr>
+        <w:tc>
+          <w:tcPr>
+            <w:tcW w:type="dxa" w:w="4680"/>
+            <w:shd w:fill="D9E2F3" w:val="clear"/>
+          </w:tcPr>
+          <w:p>
+            <w:r/>
+            <w:r>
+              <w:rPr>
+                <w:b/>
+                <w:sz w:val="18"/>
+              </w:rPr>
+              <w:t>Component</w:t>
+            </w:r>
+          </w:p>
+        </w:tc>
+        <w:tc>
+          <w:tcPr>
+            <w:tcW w:type="dxa" w:w="4680"/>
+            <w:shd w:fill="D9E2F3" w:val="clear"/>
+          </w:tcPr>
+          <w:p>
+            <w:r/>
+            <w:r>
+              <w:rPr>
+                <w:b/>
+                <w:sz w:val="18"/>
+              </w:rPr>
+              <w:t>Location</w:t>
+            </w:r>
+          </w:p>
+        </w:tc>
+      </w:tr>
+      <w:tr>
+        <w:tc>
+          <w:tcPr>
+            <w:tcW w:type="dxa" w:w="4680"/>
+          </w:tcPr>
+          <w:p>
+            <w:r/>
+            <w:r>
+              <w:rPr>
+                <w:sz w:val="18"/>
+              </w:rPr>
+              <w:t>Staging Database</w:t>
+            </w:r>
+          </w:p>
+        </w:tc>
+        <w:tc>
+          <w:tcPr>
+            <w:tcW w:type="dxa" w:w="4680"/>
+          </w:tcPr>
+          <w:p>
+            <w:r/>
+            <w:r>
+              <w:rPr>
+                <w:sz w:val="18"/>
+              </w:rPr>
+              <w:t>`team1_staging_area` on SQL Server 2016, [SERVER_NAME\INSTANCE]</w:t>
+            </w:r>
+          </w:p>
+        </w:tc>
+      </w:tr>
+      <w:tr>
+        <w:tc>
+          <w:tcPr>
+            <w:tcW w:type="dxa" w:w="4680"/>
+          </w:tcPr>
+          <w:p>
+            <w:r/>
+            <w:r>
+              <w:rPr>
+                <w:sz w:val="18"/>
+              </w:rPr>
+              <w:t>Data Mart Database</w:t>
+            </w:r>
+          </w:p>
+        </w:tc>
+        <w:tc>
+          <w:tcPr>
+            <w:tcW w:type="dxa" w:w="4680"/>
+          </w:tcPr>
+          <w:p>
+            <w:r/>
+            <w:r>
+              <w:rPr>
+                <w:sz w:val="18"/>
+              </w:rPr>
+              <w:t>`team1_dw_area` on SQL Server 2016, [SERVER_NAME\INSTANCE]</w:t>
+            </w:r>
+          </w:p>
+        </w:tc>
+      </w:tr>
+      <w:tr>
+        <w:tc>
+          <w:tcPr>
+            <w:tcW w:type="dxa" w:w="4680"/>
+          </w:tcPr>
+          <w:p>
+            <w:r/>
+            <w:r>
+              <w:rPr>
+                <w:sz w:val="18"/>
+              </w:rPr>
+              <w:t>SSIS Packages (.dtsx)</w:t>
+            </w:r>
+          </w:p>
+        </w:tc>
+        <w:tc>
+          <w:tcPr>
+            <w:tcW w:type="dxa" w:w="4680"/>
+          </w:tcPr>
+          <w:p>
+            <w:r/>
+            <w:r>
+              <w:rPr>
+                <w:sz w:val="18"/>
+              </w:rPr>
+              <w:t>Visual Studio project folder: `DFF_ETL_Project\` on lab machine</w:t>
+            </w:r>
+          </w:p>
+        </w:tc>
+      </w:tr>
+      <w:tr>
+        <w:tc>
+          <w:tcPr>
+            <w:tcW w:type="dxa" w:w="4680"/>
+          </w:tcPr>
+          <w:p>
+            <w:r/>
+            <w:r>
+              <w:rPr>
+                <w:sz w:val="18"/>
+              </w:rPr>
+              <w:t>SSRS Reports (.rdl)</w:t>
+            </w:r>
+          </w:p>
+        </w:tc>
+        <w:tc>
+          <w:tcPr>
+            <w:tcW w:type="dxa" w:w="4680"/>
+          </w:tcPr>
+          <w:p>
+            <w:r/>
+            <w:r>
+              <w:rPr>
+                <w:sz w:val="18"/>
+              </w:rPr>
+              <w:t>SSRS Report Server: `http://[SERVER_NAME]/ReportServer`</w:t>
+            </w:r>
+          </w:p>
+        </w:tc>
+      </w:tr>
+      <w:tr>
+        <w:tc>
+          <w:tcPr>
+            <w:tcW w:type="dxa" w:w="4680"/>
+          </w:tcPr>
+          <w:p>
+            <w:r/>
+            <w:r>
+              <w:rPr>
+                <w:sz w:val="18"/>
+              </w:rPr>
+              <w:t>SSAS Cube (.cube)</w:t>
+            </w:r>
+          </w:p>
+        </w:tc>
+        <w:tc>
+          <w:tcPr>
+            <w:tcW w:type="dxa" w:w="4680"/>
+          </w:tcPr>
+          <w:p>
+            <w:r/>
+            <w:r>
+              <w:rPr>
+                <w:sz w:val="18"/>
+              </w:rPr>
+              <w:t>SSAS instance: `[SERVER_NAME]\SSAS_INSTANCE`, database: `DFF_Sales_Cube`</w:t>
+            </w:r>
+          </w:p>
+        </w:tc>
+      </w:tr>
+      <w:tr>
+        <w:tc>
+          <w:tcPr>
+            <w:tcW w:type="dxa" w:w="4680"/>
+          </w:tcPr>
+          <w:p>
+            <w:r/>
+            <w:r>
+              <w:rPr>
+                <w:sz w:val="18"/>
+              </w:rPr>
+              <w:t>Power BI Dashboard (.pbix)</w:t>
+            </w:r>
+          </w:p>
+        </w:tc>
+        <w:tc>
+          <w:tcPr>
+            <w:tcW w:type="dxa" w:w="4680"/>
+          </w:tcPr>
+          <w:p>
+            <w:r/>
+            <w:r>
+              <w:rPr>
+                <w:sz w:val="18"/>
+              </w:rPr>
+              <w:t>Local file: `DFF_BQ8_Dashboard.pbix` (shared via Power BI Service if available)</w:t>
+            </w:r>
+          </w:p>
+        </w:tc>
+      </w:tr>
+      <w:tr>
+        <w:tc>
+          <w:tcPr>
+            <w:tcW w:type="dxa" w:w="4680"/>
+          </w:tcPr>
+          <w:p>
+            <w:r/>
+            <w:r>
+              <w:rPr>
+                <w:sz w:val="18"/>
+              </w:rPr>
+              <w:t>Redshift Queries</w:t>
+            </w:r>
+          </w:p>
+        </w:tc>
+        <w:tc>
+          <w:tcPr>
+            <w:tcW w:type="dxa" w:w="4680"/>
+          </w:tcPr>
+          <w:p>
+            <w:r/>
+            <w:r>
+              <w:rPr>
+                <w:sz w:val="18"/>
+              </w:rPr>
+              <w:t>Amazon Redshift Query Editor v.2, cluster: [CLUSTER_NAME]</w:t>
+            </w:r>
+          </w:p>
+        </w:tc>
+      </w:tr>
+      <w:tr>
+        <w:tc>
+          <w:tcPr>
+            <w:tcW w:type="dxa" w:w="4680"/>
+          </w:tcPr>
+          <w:p>
+            <w:r/>
+            <w:r>
+              <w:rPr>
+                <w:sz w:val="18"/>
+              </w:rPr>
+              <w:t>SQL Scripts</w:t>
+            </w:r>
+          </w:p>
+        </w:tc>
+        <w:tc>
+          <w:tcPr>
+            <w:tcW w:type="dxa" w:w="4680"/>
+          </w:tcPr>
+          <w:p>
+            <w:r/>
+            <w:r>
+              <w:rPr>
+                <w:sz w:val="18"/>
+              </w:rPr>
+              <w:t>`report_4/sql/` directory (see Appendix A)</w:t>
+            </w:r>
+          </w:p>
+        </w:tc>
+      </w:tr>
+      <w:tr>
+        <w:tc>
+          <w:tcPr>
+            <w:tcW w:type="dxa" w:w="4680"/>
+          </w:tcPr>
+          <w:p>
+            <w:r/>
+            <w:r>
+              <w:rPr>
+                <w:sz w:val="18"/>
+              </w:rPr>
+              <w:t>Mapping Tables (Excel)</w:t>
+            </w:r>
+          </w:p>
+        </w:tc>
+        <w:tc>
+          <w:tcPr>
+            <w:tcW w:type="dxa" w:w="4680"/>
+          </w:tcPr>
+          <w:p>
+            <w:r/>
+            <w:r>
+              <w:rPr>
+                <w:sz w:val="18"/>
+              </w:rPr>
+              <w:t>`MappingTables.xlsx` (see Appendix B)</w:t>
+            </w:r>
+          </w:p>
+        </w:tc>
+      </w:tr>
+    </w:tbl>
+    <w:p/>
+    <w:p>
+      <w:pPr>
+        <w:pStyle w:val="Heading2"/>
+      </w:pPr>
+      <w:r>
+        <w:t>5.4 Summary: All Business Questions Supported</w:t>
+      </w:r>
+    </w:p>
+    <w:p>
+      <w:r>
+        <w:t>The table below confirms that every professor-approved BQ is supported by at least one BI report with charts and written analysis:</w:t>
+      </w:r>
+    </w:p>
+    <w:tbl>
+      <w:tblPr>
+        <w:tblStyle w:val="TableGrid"/>
+        <w:tblW w:type="auto" w:w="0"/>
+        <w:jc w:val="center"/>
+        <w:tblLook w:firstColumn="1" w:firstRow="1" w:lastColumn="0" w:lastRow="0" w:noHBand="0" w:noVBand="1" w:val="04A0"/>
+      </w:tblPr>
+      <w:tblGrid>
+        <w:gridCol w:w="1560"/>
+        <w:gridCol w:w="1560"/>
+        <w:gridCol w:w="1560"/>
+        <w:gridCol w:w="1560"/>
+        <w:gridCol w:w="1560"/>
+        <w:gridCol w:w="1560"/>
+      </w:tblGrid>
+      <w:tr>
+        <w:tc>
+          <w:tcPr>
+            <w:tcW w:type="dxa" w:w="1560"/>
+            <w:shd w:fill="D9E2F3" w:val="clear"/>
+          </w:tcPr>
+          <w:p>
+            <w:r/>
+            <w:r>
+              <w:rPr>
+                <w:b/>
+                <w:sz w:val="18"/>
+              </w:rPr>
+              <w:t>BQ</w:t>
+            </w:r>
+          </w:p>
+        </w:tc>
+        <w:tc>
+          <w:tcPr>
+            <w:tcW w:type="dxa" w:w="1560"/>
+            <w:shd w:fill="D9E2F3" w:val="clear"/>
+          </w:tcPr>
+          <w:p>
+            <w:r/>
+            <w:r>
+              <w:rPr>
+                <w:b/>
+                <w:sz w:val="18"/>
+              </w:rPr>
+              <w:t>Question</w:t>
+            </w:r>
+          </w:p>
+        </w:tc>
+        <w:tc>
+          <w:tcPr>
+            <w:tcW w:type="dxa" w:w="1560"/>
+            <w:shd w:fill="D9E2F3" w:val="clear"/>
+          </w:tcPr>
+          <w:p>
+            <w:r/>
+            <w:r>
+              <w:rPr>
+                <w:b/>
+                <w:sz w:val="18"/>
+              </w:rPr>
+              <w:t>Tool Used</w:t>
+            </w:r>
+          </w:p>
+        </w:tc>
+        <w:tc>
+          <w:tcPr>
+            <w:tcW w:type="dxa" w:w="1560"/>
+            <w:shd w:fill="D9E2F3" w:val="clear"/>
+          </w:tcPr>
+          <w:p>
+            <w:r/>
+            <w:r>
+              <w:rPr>
+                <w:b/>
+                <w:sz w:val="18"/>
+              </w:rPr>
+              <w:t>Report Delivered</w:t>
+            </w:r>
+          </w:p>
+        </w:tc>
+        <w:tc>
+          <w:tcPr>
+            <w:tcW w:type="dxa" w:w="1560"/>
+            <w:shd w:fill="D9E2F3" w:val="clear"/>
+          </w:tcPr>
+          <w:p>
+            <w:r/>
+            <w:r>
+              <w:rPr>
+                <w:b/>
+                <w:sz w:val="18"/>
+              </w:rPr>
+              <w:t>Charts</w:t>
+            </w:r>
+          </w:p>
+        </w:tc>
+        <w:tc>
+          <w:tcPr>
+            <w:tcW w:type="dxa" w:w="1560"/>
+            <w:shd w:fill="D9E2F3" w:val="clear"/>
+          </w:tcPr>
+          <w:p>
+            <w:r/>
+            <w:r>
+              <w:rPr>
+                <w:b/>
+                <w:sz w:val="18"/>
+              </w:rPr>
+              <w:t>Analysis</w:t>
+            </w:r>
+          </w:p>
+        </w:tc>
+      </w:tr>
+      <w:tr>
+        <w:tc>
+          <w:tcPr>
+            <w:tcW w:type="dxa" w:w="1560"/>
+          </w:tcPr>
+          <w:p>
+            <w:r/>
+            <w:r>
+              <w:rPr>
+                <w:sz w:val="18"/>
+              </w:rPr>
+              <w:t>BQ2</w:t>
+            </w:r>
+          </w:p>
+        </w:tc>
+        <w:tc>
+          <w:tcPr>
+            <w:tcW w:type="dxa" w:w="1560"/>
+          </w:tcPr>
+          <w:p>
+            <w:r/>
+            <w:r>
+              <w:rPr>
+                <w:sz w:val="18"/>
+              </w:rPr>
+              <w:t>Weekly SDR unit sales</w:t>
+            </w:r>
+          </w:p>
+        </w:tc>
+        <w:tc>
+          <w:tcPr>
+            <w:tcW w:type="dxa" w:w="1560"/>
+          </w:tcPr>
+          <w:p>
+            <w:r/>
+            <w:r>
+              <w:rPr>
+                <w:sz w:val="18"/>
+              </w:rPr>
+              <w:t>SSRS</w:t>
+            </w:r>
+          </w:p>
+        </w:tc>
+        <w:tc>
+          <w:tcPr>
+            <w:tcW w:type="dxa" w:w="1560"/>
+          </w:tcPr>
+          <w:p>
+            <w:r/>
+            <w:r>
+              <w:rPr>
+                <w:sz w:val="18"/>
+              </w:rPr>
+              <w:t>Tabular + trend chart</w:t>
+            </w:r>
+          </w:p>
+        </w:tc>
+        <w:tc>
+          <w:tcPr>
+            <w:tcW w:type="dxa" w:w="1560"/>
+          </w:tcPr>
+          <w:p>
+            <w:r/>
+            <w:r>
+              <w:rPr>
+                <w:sz w:val="18"/>
+              </w:rPr>
+              <w:t>✅</w:t>
+            </w:r>
+          </w:p>
+        </w:tc>
+        <w:tc>
+          <w:tcPr>
+            <w:tcW w:type="dxa" w:w="1560"/>
+          </w:tcPr>
+          <w:p>
+            <w:r/>
+            <w:r>
+              <w:rPr>
+                <w:sz w:val="18"/>
+              </w:rPr>
+              <w:t>✅</w:t>
+            </w:r>
+          </w:p>
+        </w:tc>
+      </w:tr>
+      <w:tr>
+        <w:tc>
+          <w:tcPr>
+            <w:tcW w:type="dxa" w:w="1560"/>
+          </w:tcPr>
+          <w:p>
+            <w:r/>
+            <w:r>
+              <w:rPr>
+                <w:sz w:val="18"/>
+              </w:rPr>
+              <w:t>BQ3</w:t>
+            </w:r>
+          </w:p>
+        </w:tc>
+        <w:tc>
+          <w:tcPr>
+            <w:tcW w:type="dxa" w:w="1560"/>
+          </w:tcPr>
+          <w:p>
+            <w:r/>
+            <w:r>
+              <w:rPr>
+                <w:sz w:val="18"/>
+              </w:rPr>
+              <w:t>Promo vs non-promo sales</w:t>
+            </w:r>
+          </w:p>
+        </w:tc>
+        <w:tc>
+          <w:tcPr>
+            <w:tcW w:type="dxa" w:w="1560"/>
+          </w:tcPr>
+          <w:p>
+            <w:r/>
+            <w:r>
+              <w:rPr>
+                <w:sz w:val="18"/>
+              </w:rPr>
+              <w:t>SSAS</w:t>
+            </w:r>
+          </w:p>
+        </w:tc>
+        <w:tc>
+          <w:tcPr>
+            <w:tcW w:type="dxa" w:w="1560"/>
+          </w:tcPr>
+          <w:p>
+            <w:r/>
+            <w:r>
+              <w:rPr>
+                <w:sz w:val="18"/>
+              </w:rPr>
+              <w:t>Cube pivot + drill-down</w:t>
+            </w:r>
+          </w:p>
+        </w:tc>
+        <w:tc>
+          <w:tcPr>
+            <w:tcW w:type="dxa" w:w="1560"/>
+          </w:tcPr>
+          <w:p>
+            <w:r/>
+            <w:r>
+              <w:rPr>
+                <w:sz w:val="18"/>
+              </w:rPr>
+              <w:t>✅</w:t>
+            </w:r>
+          </w:p>
+        </w:tc>
+        <w:tc>
+          <w:tcPr>
+            <w:tcW w:type="dxa" w:w="1560"/>
+          </w:tcPr>
+          <w:p>
+            <w:r/>
+            <w:r>
+              <w:rPr>
+                <w:sz w:val="18"/>
+              </w:rPr>
+              <w:t>✅</w:t>
+            </w:r>
+          </w:p>
+        </w:tc>
+      </w:tr>
+      <w:tr>
+        <w:tc>
+          <w:tcPr>
+            <w:tcW w:type="dxa" w:w="1560"/>
+          </w:tcPr>
+          <w:p>
+            <w:r/>
+            <w:r>
+              <w:rPr>
+                <w:sz w:val="18"/>
+              </w:rPr>
+              <w:t>BQ4</w:t>
+            </w:r>
+          </w:p>
+        </w:tc>
+        <w:tc>
+          <w:tcPr>
+            <w:tcW w:type="dxa" w:w="1560"/>
+          </w:tcPr>
+          <w:p>
+            <w:r/>
+            <w:r>
+              <w:rPr>
+                <w:sz w:val="18"/>
+              </w:rPr>
+              <w:t>Promo lift by type (CSO)</w:t>
+            </w:r>
+          </w:p>
+        </w:tc>
+        <w:tc>
+          <w:tcPr>
+            <w:tcW w:type="dxa" w:w="1560"/>
+          </w:tcPr>
+          <w:p>
+            <w:r/>
+            <w:r>
+              <w:rPr>
+                <w:sz w:val="18"/>
+              </w:rPr>
+              <w:t>Redshift v.2</w:t>
+            </w:r>
+          </w:p>
+        </w:tc>
+        <w:tc>
+          <w:tcPr>
+            <w:tcW w:type="dxa" w:w="1560"/>
+          </w:tcPr>
+          <w:p>
+            <w:r/>
+            <w:r>
+              <w:rPr>
+                <w:sz w:val="18"/>
+              </w:rPr>
+              <w:t>Query results + lift table</w:t>
+            </w:r>
+          </w:p>
+        </w:tc>
+        <w:tc>
+          <w:tcPr>
+            <w:tcW w:type="dxa" w:w="1560"/>
+          </w:tcPr>
+          <w:p>
+            <w:r/>
+            <w:r>
+              <w:rPr>
+                <w:sz w:val="18"/>
+              </w:rPr>
+              <w:t>✅</w:t>
+            </w:r>
+          </w:p>
+        </w:tc>
+        <w:tc>
+          <w:tcPr>
+            <w:tcW w:type="dxa" w:w="1560"/>
+          </w:tcPr>
+          <w:p>
+            <w:r/>
+            <w:r>
+              <w:rPr>
+                <w:sz w:val="18"/>
+              </w:rPr>
+              <w:t>✅</w:t>
+            </w:r>
+          </w:p>
+        </w:tc>
+      </w:tr>
+      <w:tr>
+        <w:tc>
+          <w:tcPr>
+            <w:tcW w:type="dxa" w:w="1560"/>
+          </w:tcPr>
+          <w:p>
+            <w:r/>
+            <w:r>
+              <w:rPr>
+                <w:sz w:val="18"/>
+              </w:rPr>
+              <w:t>BQ8</w:t>
+            </w:r>
+          </w:p>
+        </w:tc>
+        <w:tc>
+          <w:tcPr>
+            <w:tcW w:type="dxa" w:w="1560"/>
+          </w:tcPr>
+          <w:p>
+            <w:r/>
+            <w:r>
+              <w:rPr>
+                <w:sz w:val="18"/>
+              </w:rPr>
+              <w:t>Store quartile tiers (TPA)</w:t>
+            </w:r>
+          </w:p>
+        </w:tc>
+        <w:tc>
+          <w:tcPr>
+            <w:tcW w:type="dxa" w:w="1560"/>
+          </w:tcPr>
+          <w:p>
+            <w:r/>
+            <w:r>
+              <w:rPr>
+                <w:sz w:val="18"/>
+              </w:rPr>
+              <w:t>Power BI</w:t>
+            </w:r>
+          </w:p>
+        </w:tc>
+        <w:tc>
+          <w:tcPr>
+            <w:tcW w:type="dxa" w:w="1560"/>
+          </w:tcPr>
+          <w:p>
+            <w:r/>
+            <w:r>
+              <w:rPr>
+                <w:sz w:val="18"/>
+              </w:rPr>
+              <w:t>Interactive dashboard</w:t>
+            </w:r>
+          </w:p>
+        </w:tc>
+        <w:tc>
+          <w:tcPr>
+            <w:tcW w:type="dxa" w:w="1560"/>
+          </w:tcPr>
+          <w:p>
+            <w:r/>
+            <w:r>
+              <w:rPr>
+                <w:sz w:val="18"/>
+              </w:rPr>
+              <w:t>✅</w:t>
+            </w:r>
+          </w:p>
+        </w:tc>
+        <w:tc>
+          <w:tcPr>
+            <w:tcW w:type="dxa" w:w="1560"/>
+          </w:tcPr>
+          <w:p>
+            <w:r/>
+            <w:r>
+              <w:rPr>
+                <w:sz w:val="18"/>
+              </w:rPr>
+              <w:t>✅</w:t>
+            </w:r>
+          </w:p>
+        </w:tc>
+      </w:tr>
+      <w:tr>
+        <w:tc>
+          <w:tcPr>
+            <w:tcW w:type="dxa" w:w="1560"/>
+          </w:tcPr>
+          <w:p>
+            <w:r/>
+            <w:r>
+              <w:rPr>
+                <w:sz w:val="18"/>
+              </w:rPr>
+              <w:t>BQ9</w:t>
+            </w:r>
+          </w:p>
+        </w:tc>
+        <w:tc>
+          <w:tcPr>
+            <w:tcW w:type="dxa" w:w="1560"/>
+          </w:tcPr>
+          <w:p>
+            <w:r/>
+            <w:r>
+              <w:rPr>
+                <w:sz w:val="18"/>
+              </w:rPr>
+              <w:t>Top 10 weekly CRA products</w:t>
+            </w:r>
+          </w:p>
+        </w:tc>
+        <w:tc>
+          <w:tcPr>
+            <w:tcW w:type="dxa" w:w="1560"/>
+          </w:tcPr>
+          <w:p>
+            <w:r/>
+            <w:r>
+              <w:rPr>
+                <w:sz w:val="18"/>
+              </w:rPr>
+              <w:t>SSRS</w:t>
+            </w:r>
+          </w:p>
+        </w:tc>
+        <w:tc>
+          <w:tcPr>
+            <w:tcW w:type="dxa" w:w="1560"/>
+          </w:tcPr>
+          <w:p>
+            <w:r/>
+            <w:r>
+              <w:rPr>
+                <w:sz w:val="18"/>
+              </w:rPr>
+              <w:t>Parameterized report</w:t>
+            </w:r>
+          </w:p>
+        </w:tc>
+        <w:tc>
+          <w:tcPr>
+            <w:tcW w:type="dxa" w:w="1560"/>
+          </w:tcPr>
+          <w:p>
+            <w:r/>
+            <w:r>
+              <w:rPr>
+                <w:sz w:val="18"/>
+              </w:rPr>
+              <w:t>✅</w:t>
+            </w:r>
+          </w:p>
+        </w:tc>
+        <w:tc>
+          <w:tcPr>
+            <w:tcW w:type="dxa" w:w="1560"/>
+          </w:tcPr>
+          <w:p>
+            <w:r/>
+            <w:r>
+              <w:rPr>
+                <w:sz w:val="18"/>
+              </w:rPr>
+              <w:t>✅</w:t>
+            </w:r>
+          </w:p>
+        </w:tc>
+      </w:tr>
+    </w:tbl>
+    <w:p/>
     <w:p>
       <w:pPr>
         <w:spacing w:before="120" w:after="120"/>
@@ -26553,19 +28662,1653 @@
         <w:pStyle w:val="Heading2"/>
       </w:pPr>
       <w:r>
-        <w:t>Appendix B: Mapping Tables (Excel)</w:t>
+        <w:t>Appendix B: Mapping Tables</w:t>
       </w:r>
     </w:p>
     <w:p>
-      <w:r/>
+      <w:r>
+        <w:t>The complete mapping tables documenting the data lineage from source files through staging to the data mart are provided below. The Excel version of these tables (</w:t>
+      </w:r>
       <w:r>
         <w:rPr>
-          <w:i/>
+          <w:rFonts w:ascii="Consolas" w:hAnsi="Consolas"/>
+          <w:color w:val="C0392B"/>
+          <w:sz w:val="18"/>
         </w:rPr>
-        <w:t>[Insert Excel versions of Mapping Table #1 and Mapping Table #2 here]</w:t>
+        <w:t>MappingTables.xlsx</w:t>
       </w:r>
-      <w:r/>
+      <w:r>
+        <w:t>) is included as a separate attachment.</w:t>
+      </w:r>
     </w:p>
+    <w:p>
+      <w:pPr>
+        <w:pStyle w:val="Heading3"/>
+      </w:pPr>
+      <w:r>
+        <w:t>Mapping Table #1: Source Files to Staging Tables (Summary)</w:t>
+      </w:r>
+    </w:p>
+    <w:tbl>
+      <w:tblPr>
+        <w:tblStyle w:val="TableGrid"/>
+        <w:tblW w:type="auto" w:w="0"/>
+        <w:jc w:val="center"/>
+        <w:tblLook w:firstColumn="1" w:firstRow="1" w:lastColumn="0" w:lastRow="0" w:noHBand="0" w:noVBand="1" w:val="04A0"/>
+      </w:tblPr>
+      <w:tblGrid>
+        <w:gridCol w:w="2340"/>
+        <w:gridCol w:w="2340"/>
+        <w:gridCol w:w="2340"/>
+        <w:gridCol w:w="2340"/>
+      </w:tblGrid>
+      <w:tr>
+        <w:tc>
+          <w:tcPr>
+            <w:tcW w:type="dxa" w:w="2340"/>
+            <w:shd w:fill="D9E2F3" w:val="clear"/>
+          </w:tcPr>
+          <w:p>
+            <w:r/>
+            <w:r>
+              <w:rPr>
+                <w:b/>
+                <w:sz w:val="18"/>
+              </w:rPr>
+              <w:t>Source File</w:t>
+            </w:r>
+          </w:p>
+        </w:tc>
+        <w:tc>
+          <w:tcPr>
+            <w:tcW w:type="dxa" w:w="2340"/>
+            <w:shd w:fill="D9E2F3" w:val="clear"/>
+          </w:tcPr>
+          <w:p>
+            <w:r/>
+            <w:r>
+              <w:rPr>
+                <w:b/>
+                <w:sz w:val="18"/>
+              </w:rPr>
+              <w:t>Key Columns Extracted</w:t>
+            </w:r>
+          </w:p>
+        </w:tc>
+        <w:tc>
+          <w:tcPr>
+            <w:tcW w:type="dxa" w:w="2340"/>
+            <w:shd w:fill="D9E2F3" w:val="clear"/>
+          </w:tcPr>
+          <w:p>
+            <w:r/>
+            <w:r>
+              <w:rPr>
+                <w:b/>
+                <w:sz w:val="18"/>
+              </w:rPr>
+              <w:t>Staging Table</w:t>
+            </w:r>
+          </w:p>
+        </w:tc>
+        <w:tc>
+          <w:tcPr>
+            <w:tcW w:type="dxa" w:w="2340"/>
+            <w:shd w:fill="D9E2F3" w:val="clear"/>
+          </w:tcPr>
+          <w:p>
+            <w:r/>
+            <w:r>
+              <w:rPr>
+                <w:b/>
+                <w:sz w:val="18"/>
+              </w:rPr>
+              <w:t>Derived Column</w:t>
+            </w:r>
+          </w:p>
+        </w:tc>
+      </w:tr>
+      <w:tr>
+        <w:tc>
+          <w:tcPr>
+            <w:tcW w:type="dxa" w:w="2340"/>
+          </w:tcPr>
+          <w:p>
+            <w:r/>
+            <w:r>
+              <w:rPr>
+                <w:sz w:val="18"/>
+              </w:rPr>
+              <w:t>wsdr.csv</w:t>
+            </w:r>
+          </w:p>
+        </w:tc>
+        <w:tc>
+          <w:tcPr>
+            <w:tcW w:type="dxa" w:w="2340"/>
+          </w:tcPr>
+          <w:p>
+            <w:r/>
+            <w:r>
+              <w:rPr>
+                <w:sz w:val="18"/>
+              </w:rPr>
+              <w:t>UPC, STORE, WEEK, MOVE, QTY, PRICE, SALE, PROFIT, OK</w:t>
+            </w:r>
+          </w:p>
+        </w:tc>
+        <w:tc>
+          <w:tcPr>
+            <w:tcW w:type="dxa" w:w="2340"/>
+          </w:tcPr>
+          <w:p>
+            <w:r/>
+            <w:r>
+              <w:rPr>
+                <w:sz w:val="18"/>
+              </w:rPr>
+              <w:t>stg_Movement_SDR</w:t>
+            </w:r>
+          </w:p>
+        </w:tc>
+        <w:tc>
+          <w:tcPr>
+            <w:tcW w:type="dxa" w:w="2340"/>
+          </w:tcPr>
+          <w:p>
+            <w:r/>
+            <w:r>
+              <w:rPr>
+                <w:sz w:val="18"/>
+              </w:rPr>
+              <w:t>CATEGORY_CODE = 'SDR'</w:t>
+            </w:r>
+          </w:p>
+        </w:tc>
+      </w:tr>
+      <w:tr>
+        <w:tc>
+          <w:tcPr>
+            <w:tcW w:type="dxa" w:w="2340"/>
+          </w:tcPr>
+          <w:p>
+            <w:r/>
+            <w:r>
+              <w:rPr>
+                <w:sz w:val="18"/>
+              </w:rPr>
+              <w:t>WCSO-Done.csv</w:t>
+            </w:r>
+          </w:p>
+        </w:tc>
+        <w:tc>
+          <w:tcPr>
+            <w:tcW w:type="dxa" w:w="2340"/>
+          </w:tcPr>
+          <w:p>
+            <w:r/>
+            <w:r>
+              <w:rPr>
+                <w:sz w:val="18"/>
+              </w:rPr>
+              <w:t>UPC, STORE, WEEK, MOVE, QTY, PRICE, SALE, PROFIT, OK</w:t>
+            </w:r>
+          </w:p>
+        </w:tc>
+        <w:tc>
+          <w:tcPr>
+            <w:tcW w:type="dxa" w:w="2340"/>
+          </w:tcPr>
+          <w:p>
+            <w:r/>
+            <w:r>
+              <w:rPr>
+                <w:sz w:val="18"/>
+              </w:rPr>
+              <w:t>stg_Movement_CSO</w:t>
+            </w:r>
+          </w:p>
+        </w:tc>
+        <w:tc>
+          <w:tcPr>
+            <w:tcW w:type="dxa" w:w="2340"/>
+          </w:tcPr>
+          <w:p>
+            <w:r/>
+            <w:r>
+              <w:rPr>
+                <w:sz w:val="18"/>
+              </w:rPr>
+              <w:t>CATEGORY_CODE = 'CSO'</w:t>
+            </w:r>
+          </w:p>
+        </w:tc>
+      </w:tr>
+      <w:tr>
+        <w:tc>
+          <w:tcPr>
+            <w:tcW w:type="dxa" w:w="2340"/>
+          </w:tcPr>
+          <w:p>
+            <w:r/>
+            <w:r>
+              <w:rPr>
+                <w:sz w:val="18"/>
+              </w:rPr>
+              <w:t>WTPA_done.csv</w:t>
+            </w:r>
+          </w:p>
+        </w:tc>
+        <w:tc>
+          <w:tcPr>
+            <w:tcW w:type="dxa" w:w="2340"/>
+          </w:tcPr>
+          <w:p>
+            <w:r/>
+            <w:r>
+              <w:rPr>
+                <w:sz w:val="18"/>
+              </w:rPr>
+              <w:t>UPC, STORE, WEEK, MOVE, QTY, PRICE, SALE, PROFIT, OK</w:t>
+            </w:r>
+          </w:p>
+        </w:tc>
+        <w:tc>
+          <w:tcPr>
+            <w:tcW w:type="dxa" w:w="2340"/>
+          </w:tcPr>
+          <w:p>
+            <w:r/>
+            <w:r>
+              <w:rPr>
+                <w:sz w:val="18"/>
+              </w:rPr>
+              <w:t>stg_Movement_TPA</w:t>
+            </w:r>
+          </w:p>
+        </w:tc>
+        <w:tc>
+          <w:tcPr>
+            <w:tcW w:type="dxa" w:w="2340"/>
+          </w:tcPr>
+          <w:p>
+            <w:r/>
+            <w:r>
+              <w:rPr>
+                <w:sz w:val="18"/>
+              </w:rPr>
+              <w:t>CATEGORY_CODE = 'TPA'</w:t>
+            </w:r>
+          </w:p>
+        </w:tc>
+      </w:tr>
+      <w:tr>
+        <w:tc>
+          <w:tcPr>
+            <w:tcW w:type="dxa" w:w="2340"/>
+          </w:tcPr>
+          <w:p>
+            <w:r/>
+            <w:r>
+              <w:rPr>
+                <w:sz w:val="18"/>
+              </w:rPr>
+              <w:t>Done-WCRA.csv</w:t>
+            </w:r>
+          </w:p>
+        </w:tc>
+        <w:tc>
+          <w:tcPr>
+            <w:tcW w:type="dxa" w:w="2340"/>
+          </w:tcPr>
+          <w:p>
+            <w:r/>
+            <w:r>
+              <w:rPr>
+                <w:sz w:val="18"/>
+              </w:rPr>
+              <w:t>UPC, STORE, WEEK, MOVE, QTY, PRICE, SALE, PROFIT, OK</w:t>
+            </w:r>
+          </w:p>
+        </w:tc>
+        <w:tc>
+          <w:tcPr>
+            <w:tcW w:type="dxa" w:w="2340"/>
+          </w:tcPr>
+          <w:p>
+            <w:r/>
+            <w:r>
+              <w:rPr>
+                <w:sz w:val="18"/>
+              </w:rPr>
+              <w:t>stg_Movement_CRA</w:t>
+            </w:r>
+          </w:p>
+        </w:tc>
+        <w:tc>
+          <w:tcPr>
+            <w:tcW w:type="dxa" w:w="2340"/>
+          </w:tcPr>
+          <w:p>
+            <w:r/>
+            <w:r>
+              <w:rPr>
+                <w:sz w:val="18"/>
+              </w:rPr>
+              <w:t>CATEGORY_CODE = 'CRA'</w:t>
+            </w:r>
+          </w:p>
+        </w:tc>
+      </w:tr>
+      <w:tr>
+        <w:tc>
+          <w:tcPr>
+            <w:tcW w:type="dxa" w:w="2340"/>
+          </w:tcPr>
+          <w:p>
+            <w:r/>
+            <w:r>
+              <w:rPr>
+                <w:sz w:val="18"/>
+              </w:rPr>
+              <w:t>UPCSDR.csv</w:t>
+            </w:r>
+          </w:p>
+        </w:tc>
+        <w:tc>
+          <w:tcPr>
+            <w:tcW w:type="dxa" w:w="2340"/>
+          </w:tcPr>
+          <w:p>
+            <w:r/>
+            <w:r>
+              <w:rPr>
+                <w:sz w:val="18"/>
+              </w:rPr>
+              <w:t>COM_CODE, UPC, DESCRIP, SIZE, CASE, NITEM</w:t>
+            </w:r>
+          </w:p>
+        </w:tc>
+        <w:tc>
+          <w:tcPr>
+            <w:tcW w:type="dxa" w:w="2340"/>
+          </w:tcPr>
+          <w:p>
+            <w:r/>
+            <w:r>
+              <w:rPr>
+                <w:sz w:val="18"/>
+              </w:rPr>
+              <w:t>stg_Product_SDR</w:t>
+            </w:r>
+          </w:p>
+        </w:tc>
+        <w:tc>
+          <w:tcPr>
+            <w:tcW w:type="dxa" w:w="2340"/>
+          </w:tcPr>
+          <w:p>
+            <w:r/>
+            <w:r>
+              <w:rPr>
+                <w:sz w:val="18"/>
+              </w:rPr>
+              <w:t>CATEGORY_CODE = 'SDR'</w:t>
+            </w:r>
+          </w:p>
+        </w:tc>
+      </w:tr>
+      <w:tr>
+        <w:tc>
+          <w:tcPr>
+            <w:tcW w:type="dxa" w:w="2340"/>
+          </w:tcPr>
+          <w:p>
+            <w:r/>
+            <w:r>
+              <w:rPr>
+                <w:sz w:val="18"/>
+              </w:rPr>
+              <w:t>UPCCSO.csv</w:t>
+            </w:r>
+          </w:p>
+        </w:tc>
+        <w:tc>
+          <w:tcPr>
+            <w:tcW w:type="dxa" w:w="2340"/>
+          </w:tcPr>
+          <w:p>
+            <w:r/>
+            <w:r>
+              <w:rPr>
+                <w:sz w:val="18"/>
+              </w:rPr>
+              <w:t>COM_CODE, UPC, DESCRIP, SIZE, CASE, NITEM</w:t>
+            </w:r>
+          </w:p>
+        </w:tc>
+        <w:tc>
+          <w:tcPr>
+            <w:tcW w:type="dxa" w:w="2340"/>
+          </w:tcPr>
+          <w:p>
+            <w:r/>
+            <w:r>
+              <w:rPr>
+                <w:sz w:val="18"/>
+              </w:rPr>
+              <w:t>stg_Product_CSO</w:t>
+            </w:r>
+          </w:p>
+        </w:tc>
+        <w:tc>
+          <w:tcPr>
+            <w:tcW w:type="dxa" w:w="2340"/>
+          </w:tcPr>
+          <w:p>
+            <w:r/>
+            <w:r>
+              <w:rPr>
+                <w:sz w:val="18"/>
+              </w:rPr>
+              <w:t>CATEGORY_CODE = 'CSO'</w:t>
+            </w:r>
+          </w:p>
+        </w:tc>
+      </w:tr>
+      <w:tr>
+        <w:tc>
+          <w:tcPr>
+            <w:tcW w:type="dxa" w:w="2340"/>
+          </w:tcPr>
+          <w:p>
+            <w:r/>
+            <w:r>
+              <w:rPr>
+                <w:sz w:val="18"/>
+              </w:rPr>
+              <w:t>UPCTPA.csv</w:t>
+            </w:r>
+          </w:p>
+        </w:tc>
+        <w:tc>
+          <w:tcPr>
+            <w:tcW w:type="dxa" w:w="2340"/>
+          </w:tcPr>
+          <w:p>
+            <w:r/>
+            <w:r>
+              <w:rPr>
+                <w:sz w:val="18"/>
+              </w:rPr>
+              <w:t>COM_CODE, UPC, DESCRIP, SIZE, CASE, NITEM</w:t>
+            </w:r>
+          </w:p>
+        </w:tc>
+        <w:tc>
+          <w:tcPr>
+            <w:tcW w:type="dxa" w:w="2340"/>
+          </w:tcPr>
+          <w:p>
+            <w:r/>
+            <w:r>
+              <w:rPr>
+                <w:sz w:val="18"/>
+              </w:rPr>
+              <w:t>stg_Product_TPA</w:t>
+            </w:r>
+          </w:p>
+        </w:tc>
+        <w:tc>
+          <w:tcPr>
+            <w:tcW w:type="dxa" w:w="2340"/>
+          </w:tcPr>
+          <w:p>
+            <w:r/>
+            <w:r>
+              <w:rPr>
+                <w:sz w:val="18"/>
+              </w:rPr>
+              <w:t>CATEGORY_CODE = 'TPA'</w:t>
+            </w:r>
+          </w:p>
+        </w:tc>
+      </w:tr>
+      <w:tr>
+        <w:tc>
+          <w:tcPr>
+            <w:tcW w:type="dxa" w:w="2340"/>
+          </w:tcPr>
+          <w:p>
+            <w:r/>
+            <w:r>
+              <w:rPr>
+                <w:sz w:val="18"/>
+              </w:rPr>
+              <w:t>UPCCRA.csv</w:t>
+            </w:r>
+          </w:p>
+        </w:tc>
+        <w:tc>
+          <w:tcPr>
+            <w:tcW w:type="dxa" w:w="2340"/>
+          </w:tcPr>
+          <w:p>
+            <w:r/>
+            <w:r>
+              <w:rPr>
+                <w:sz w:val="18"/>
+              </w:rPr>
+              <w:t>COM_CODE, UPC, DESCRIP, SIZE, CASE, NITEM</w:t>
+            </w:r>
+          </w:p>
+        </w:tc>
+        <w:tc>
+          <w:tcPr>
+            <w:tcW w:type="dxa" w:w="2340"/>
+          </w:tcPr>
+          <w:p>
+            <w:r/>
+            <w:r>
+              <w:rPr>
+                <w:sz w:val="18"/>
+              </w:rPr>
+              <w:t>stg_Product_CRA</w:t>
+            </w:r>
+          </w:p>
+        </w:tc>
+        <w:tc>
+          <w:tcPr>
+            <w:tcW w:type="dxa" w:w="2340"/>
+          </w:tcPr>
+          <w:p>
+            <w:r/>
+            <w:r>
+              <w:rPr>
+                <w:sz w:val="18"/>
+              </w:rPr>
+              <w:t>CATEGORY_CODE = 'CRA'</w:t>
+            </w:r>
+          </w:p>
+        </w:tc>
+      </w:tr>
+      <w:tr>
+        <w:tc>
+          <w:tcPr>
+            <w:tcW w:type="dxa" w:w="2340"/>
+          </w:tcPr>
+          <w:p>
+            <w:r/>
+            <w:r>
+              <w:rPr>
+                <w:sz w:val="18"/>
+              </w:rPr>
+              <w:t>DEMO.csv</w:t>
+            </w:r>
+          </w:p>
+        </w:tc>
+        <w:tc>
+          <w:tcPr>
+            <w:tcW w:type="dxa" w:w="2340"/>
+          </w:tcPr>
+          <w:p>
+            <w:r/>
+            <w:r>
+              <w:rPr>
+                <w:sz w:val="18"/>
+              </w:rPr>
+              <w:t>STORE, NAME, CITY, ZIP, ZONE, URBAN, WEEKVOL, INCOME, EDUC, POVERTY, HSIZEAVG, ETHNIC, DENSITY, AGE9, AGE60, WORKWOM, PRICLOW, PRICMED, PRICHIGH</w:t>
+            </w:r>
+          </w:p>
+        </w:tc>
+        <w:tc>
+          <w:tcPr>
+            <w:tcW w:type="dxa" w:w="2340"/>
+          </w:tcPr>
+          <w:p>
+            <w:r/>
+            <w:r>
+              <w:rPr>
+                <w:sz w:val="18"/>
+              </w:rPr>
+              <w:t>stg_Store</w:t>
+            </w:r>
+          </w:p>
+        </w:tc>
+        <w:tc>
+          <w:tcPr>
+            <w:tcW w:type="dxa" w:w="2340"/>
+          </w:tcPr>
+          <w:p>
+            <w:r/>
+            <w:r>
+              <w:rPr>
+                <w:sz w:val="18"/>
+              </w:rPr>
+              <w:t>—</w:t>
+            </w:r>
+          </w:p>
+        </w:tc>
+      </w:tr>
+    </w:tbl>
+    <w:p/>
+    <w:p>
+      <w:pPr>
+        <w:pStyle w:val="Heading3"/>
+      </w:pPr>
+      <w:r>
+        <w:t>Mapping Table #2: Staging Tables to Data Mart Tables (Summary)</w:t>
+      </w:r>
+    </w:p>
+    <w:tbl>
+      <w:tblPr>
+        <w:tblStyle w:val="TableGrid"/>
+        <w:tblW w:type="auto" w:w="0"/>
+        <w:jc w:val="center"/>
+        <w:tblLook w:firstColumn="1" w:firstRow="1" w:lastColumn="0" w:lastRow="0" w:noHBand="0" w:noVBand="1" w:val="04A0"/>
+      </w:tblPr>
+      <w:tblGrid>
+        <w:gridCol w:w="2340"/>
+        <w:gridCol w:w="2340"/>
+        <w:gridCol w:w="2340"/>
+        <w:gridCol w:w="2340"/>
+      </w:tblGrid>
+      <w:tr>
+        <w:tc>
+          <w:tcPr>
+            <w:tcW w:type="dxa" w:w="2340"/>
+            <w:shd w:fill="D9E2F3" w:val="clear"/>
+          </w:tcPr>
+          <w:p>
+            <w:r/>
+            <w:r>
+              <w:rPr>
+                <w:b/>
+                <w:sz w:val="18"/>
+              </w:rPr>
+              <w:t>Staging Source</w:t>
+            </w:r>
+          </w:p>
+        </w:tc>
+        <w:tc>
+          <w:tcPr>
+            <w:tcW w:type="dxa" w:w="2340"/>
+            <w:shd w:fill="D9E2F3" w:val="clear"/>
+          </w:tcPr>
+          <w:p>
+            <w:r/>
+            <w:r>
+              <w:rPr>
+                <w:b/>
+                <w:sz w:val="18"/>
+              </w:rPr>
+              <w:t>Transformation</w:t>
+            </w:r>
+          </w:p>
+        </w:tc>
+        <w:tc>
+          <w:tcPr>
+            <w:tcW w:type="dxa" w:w="2340"/>
+            <w:shd w:fill="D9E2F3" w:val="clear"/>
+          </w:tcPr>
+          <w:p>
+            <w:r/>
+            <w:r>
+              <w:rPr>
+                <w:b/>
+                <w:sz w:val="18"/>
+              </w:rPr>
+              <w:t>Data Mart Target</w:t>
+            </w:r>
+          </w:p>
+        </w:tc>
+        <w:tc>
+          <w:tcPr>
+            <w:tcW w:type="dxa" w:w="2340"/>
+            <w:shd w:fill="D9E2F3" w:val="clear"/>
+          </w:tcPr>
+          <w:p>
+            <w:r/>
+            <w:r>
+              <w:rPr>
+                <w:b/>
+                <w:sz w:val="18"/>
+              </w:rPr>
+              <w:t>Mapping Type</w:t>
+            </w:r>
+          </w:p>
+        </w:tc>
+      </w:tr>
+      <w:tr>
+        <w:tc>
+          <w:tcPr>
+            <w:tcW w:type="dxa" w:w="2340"/>
+          </w:tcPr>
+          <w:p>
+            <w:r/>
+            <w:r>
+              <w:rPr>
+                <w:sz w:val="18"/>
+              </w:rPr>
+              <w:t>stg_Movement_*.MOVE</w:t>
+            </w:r>
+          </w:p>
+        </w:tc>
+        <w:tc>
+          <w:tcPr>
+            <w:tcW w:type="dxa" w:w="2340"/>
+          </w:tcPr>
+          <w:p>
+            <w:r/>
+            <w:r>
+              <w:rPr>
+                <w:sz w:val="18"/>
+              </w:rPr>
+              <w:t>Direct copy</w:t>
+            </w:r>
+          </w:p>
+        </w:tc>
+        <w:tc>
+          <w:tcPr>
+            <w:tcW w:type="dxa" w:w="2340"/>
+          </w:tcPr>
+          <w:p>
+            <w:r/>
+            <w:r>
+              <w:rPr>
+                <w:sz w:val="18"/>
+              </w:rPr>
+              <w:t>FactWeeklySales.units_sold</w:t>
+            </w:r>
+          </w:p>
+        </w:tc>
+        <w:tc>
+          <w:tcPr>
+            <w:tcW w:type="dxa" w:w="2340"/>
+          </w:tcPr>
+          <w:p>
+            <w:r/>
+            <w:r>
+              <w:rPr>
+                <w:sz w:val="18"/>
+              </w:rPr>
+              <w:t>Copy</w:t>
+            </w:r>
+          </w:p>
+        </w:tc>
+      </w:tr>
+      <w:tr>
+        <w:tc>
+          <w:tcPr>
+            <w:tcW w:type="dxa" w:w="2340"/>
+          </w:tcPr>
+          <w:p>
+            <w:r/>
+            <w:r>
+              <w:rPr>
+                <w:sz w:val="18"/>
+              </w:rPr>
+              <w:t>stg_Movement_*.PRICE / QTY</w:t>
+            </w:r>
+          </w:p>
+        </w:tc>
+        <w:tc>
+          <w:tcPr>
+            <w:tcW w:type="dxa" w:w="2340"/>
+          </w:tcPr>
+          <w:p>
+            <w:r/>
+            <w:r>
+              <w:rPr>
+                <w:sz w:val="18"/>
+              </w:rPr>
+              <w:t>Computed</w:t>
+            </w:r>
+          </w:p>
+        </w:tc>
+        <w:tc>
+          <w:tcPr>
+            <w:tcW w:type="dxa" w:w="2340"/>
+          </w:tcPr>
+          <w:p>
+            <w:r/>
+            <w:r>
+              <w:rPr>
+                <w:sz w:val="18"/>
+              </w:rPr>
+              <w:t>FactWeeklySales.unit_price</w:t>
+            </w:r>
+          </w:p>
+        </w:tc>
+        <w:tc>
+          <w:tcPr>
+            <w:tcW w:type="dxa" w:w="2340"/>
+          </w:tcPr>
+          <w:p>
+            <w:r/>
+            <w:r>
+              <w:rPr>
+                <w:sz w:val="18"/>
+              </w:rPr>
+              <w:t>Transform</w:t>
+            </w:r>
+          </w:p>
+        </w:tc>
+      </w:tr>
+      <w:tr>
+        <w:tc>
+          <w:tcPr>
+            <w:tcW w:type="dxa" w:w="2340"/>
+          </w:tcPr>
+          <w:p>
+            <w:r/>
+            <w:r>
+              <w:rPr>
+                <w:sz w:val="18"/>
+              </w:rPr>
+              <w:t>stg_Movement_*.MOVE × (PRICE/QTY)</w:t>
+            </w:r>
+          </w:p>
+        </w:tc>
+        <w:tc>
+          <w:tcPr>
+            <w:tcW w:type="dxa" w:w="2340"/>
+          </w:tcPr>
+          <w:p>
+            <w:r/>
+            <w:r>
+              <w:rPr>
+                <w:sz w:val="18"/>
+              </w:rPr>
+              <w:t>Computed</w:t>
+            </w:r>
+          </w:p>
+        </w:tc>
+        <w:tc>
+          <w:tcPr>
+            <w:tcW w:type="dxa" w:w="2340"/>
+          </w:tcPr>
+          <w:p>
+            <w:r/>
+            <w:r>
+              <w:rPr>
+                <w:sz w:val="18"/>
+              </w:rPr>
+              <w:t>FactWeeklySales.revenue</w:t>
+            </w:r>
+          </w:p>
+        </w:tc>
+        <w:tc>
+          <w:tcPr>
+            <w:tcW w:type="dxa" w:w="2340"/>
+          </w:tcPr>
+          <w:p>
+            <w:r/>
+            <w:r>
+              <w:rPr>
+                <w:sz w:val="18"/>
+              </w:rPr>
+              <w:t>Transform</w:t>
+            </w:r>
+          </w:p>
+        </w:tc>
+      </w:tr>
+      <w:tr>
+        <w:tc>
+          <w:tcPr>
+            <w:tcW w:type="dxa" w:w="2340"/>
+          </w:tcPr>
+          <w:p>
+            <w:r/>
+            <w:r>
+              <w:rPr>
+                <w:sz w:val="18"/>
+              </w:rPr>
+              <w:t>stg_Movement_*.PROFIT</w:t>
+            </w:r>
+          </w:p>
+        </w:tc>
+        <w:tc>
+          <w:tcPr>
+            <w:tcW w:type="dxa" w:w="2340"/>
+          </w:tcPr>
+          <w:p>
+            <w:r/>
+            <w:r>
+              <w:rPr>
+                <w:sz w:val="18"/>
+              </w:rPr>
+              <w:t>Direct copy</w:t>
+            </w:r>
+          </w:p>
+        </w:tc>
+        <w:tc>
+          <w:tcPr>
+            <w:tcW w:type="dxa" w:w="2340"/>
+          </w:tcPr>
+          <w:p>
+            <w:r/>
+            <w:r>
+              <w:rPr>
+                <w:sz w:val="18"/>
+              </w:rPr>
+              <w:t>FactWeeklySales.gross_profit</w:t>
+            </w:r>
+          </w:p>
+        </w:tc>
+        <w:tc>
+          <w:tcPr>
+            <w:tcW w:type="dxa" w:w="2340"/>
+          </w:tcPr>
+          <w:p>
+            <w:r/>
+            <w:r>
+              <w:rPr>
+                <w:sz w:val="18"/>
+              </w:rPr>
+              <w:t>Copy</w:t>
+            </w:r>
+          </w:p>
+        </w:tc>
+      </w:tr>
+      <w:tr>
+        <w:tc>
+          <w:tcPr>
+            <w:tcW w:type="dxa" w:w="2340"/>
+          </w:tcPr>
+          <w:p>
+            <w:r/>
+            <w:r>
+              <w:rPr>
+                <w:sz w:val="18"/>
+              </w:rPr>
+              <w:t>stg_Movement_*.PROFIT / revenue × 100</w:t>
+            </w:r>
+          </w:p>
+        </w:tc>
+        <w:tc>
+          <w:tcPr>
+            <w:tcW w:type="dxa" w:w="2340"/>
+          </w:tcPr>
+          <w:p>
+            <w:r/>
+            <w:r>
+              <w:rPr>
+                <w:sz w:val="18"/>
+              </w:rPr>
+              <w:t>Computed</w:t>
+            </w:r>
+          </w:p>
+        </w:tc>
+        <w:tc>
+          <w:tcPr>
+            <w:tcW w:type="dxa" w:w="2340"/>
+          </w:tcPr>
+          <w:p>
+            <w:r/>
+            <w:r>
+              <w:rPr>
+                <w:sz w:val="18"/>
+              </w:rPr>
+              <w:t>FactWeeklySales.profit_margin_pct</w:t>
+            </w:r>
+          </w:p>
+        </w:tc>
+        <w:tc>
+          <w:tcPr>
+            <w:tcW w:type="dxa" w:w="2340"/>
+          </w:tcPr>
+          <w:p>
+            <w:r/>
+            <w:r>
+              <w:rPr>
+                <w:sz w:val="18"/>
+              </w:rPr>
+              <w:t>Transform</w:t>
+            </w:r>
+          </w:p>
+        </w:tc>
+      </w:tr>
+      <w:tr>
+        <w:tc>
+          <w:tcPr>
+            <w:tcW w:type="dxa" w:w="2340"/>
+          </w:tcPr>
+          <w:p>
+            <w:r/>
+            <w:r>
+              <w:rPr>
+                <w:sz w:val="18"/>
+              </w:rPr>
+              <w:t>stg_Movement_*.UPC</w:t>
+            </w:r>
+          </w:p>
+        </w:tc>
+        <w:tc>
+          <w:tcPr>
+            <w:tcW w:type="dxa" w:w="2340"/>
+          </w:tcPr>
+          <w:p>
+            <w:r/>
+            <w:r>
+              <w:rPr>
+                <w:sz w:val="18"/>
+              </w:rPr>
+              <w:t>Lookup → DimProduct</w:t>
+            </w:r>
+          </w:p>
+        </w:tc>
+        <w:tc>
+          <w:tcPr>
+            <w:tcW w:type="dxa" w:w="2340"/>
+          </w:tcPr>
+          <w:p>
+            <w:r/>
+            <w:r>
+              <w:rPr>
+                <w:sz w:val="18"/>
+              </w:rPr>
+              <w:t>FactWeeklySales.product_key</w:t>
+            </w:r>
+          </w:p>
+        </w:tc>
+        <w:tc>
+          <w:tcPr>
+            <w:tcW w:type="dxa" w:w="2340"/>
+          </w:tcPr>
+          <w:p>
+            <w:r/>
+            <w:r>
+              <w:rPr>
+                <w:sz w:val="18"/>
+              </w:rPr>
+              <w:t>Surrogate Key</w:t>
+            </w:r>
+          </w:p>
+        </w:tc>
+      </w:tr>
+      <w:tr>
+        <w:tc>
+          <w:tcPr>
+            <w:tcW w:type="dxa" w:w="2340"/>
+          </w:tcPr>
+          <w:p>
+            <w:r/>
+            <w:r>
+              <w:rPr>
+                <w:sz w:val="18"/>
+              </w:rPr>
+              <w:t>stg_Movement_*.STORE</w:t>
+            </w:r>
+          </w:p>
+        </w:tc>
+        <w:tc>
+          <w:tcPr>
+            <w:tcW w:type="dxa" w:w="2340"/>
+          </w:tcPr>
+          <w:p>
+            <w:r/>
+            <w:r>
+              <w:rPr>
+                <w:sz w:val="18"/>
+              </w:rPr>
+              <w:t>Lookup → DimStore</w:t>
+            </w:r>
+          </w:p>
+        </w:tc>
+        <w:tc>
+          <w:tcPr>
+            <w:tcW w:type="dxa" w:w="2340"/>
+          </w:tcPr>
+          <w:p>
+            <w:r/>
+            <w:r>
+              <w:rPr>
+                <w:sz w:val="18"/>
+              </w:rPr>
+              <w:t>FactWeeklySales.store_key</w:t>
+            </w:r>
+          </w:p>
+        </w:tc>
+        <w:tc>
+          <w:tcPr>
+            <w:tcW w:type="dxa" w:w="2340"/>
+          </w:tcPr>
+          <w:p>
+            <w:r/>
+            <w:r>
+              <w:rPr>
+                <w:sz w:val="18"/>
+              </w:rPr>
+              <w:t>Surrogate Key</w:t>
+            </w:r>
+          </w:p>
+        </w:tc>
+      </w:tr>
+      <w:tr>
+        <w:tc>
+          <w:tcPr>
+            <w:tcW w:type="dxa" w:w="2340"/>
+          </w:tcPr>
+          <w:p>
+            <w:r/>
+            <w:r>
+              <w:rPr>
+                <w:sz w:val="18"/>
+              </w:rPr>
+              <w:t>stg_Movement_*.WEEK</w:t>
+            </w:r>
+          </w:p>
+        </w:tc>
+        <w:tc>
+          <w:tcPr>
+            <w:tcW w:type="dxa" w:w="2340"/>
+          </w:tcPr>
+          <w:p>
+            <w:r/>
+            <w:r>
+              <w:rPr>
+                <w:sz w:val="18"/>
+              </w:rPr>
+              <w:t>Lookup → DimTime</w:t>
+            </w:r>
+          </w:p>
+        </w:tc>
+        <w:tc>
+          <w:tcPr>
+            <w:tcW w:type="dxa" w:w="2340"/>
+          </w:tcPr>
+          <w:p>
+            <w:r/>
+            <w:r>
+              <w:rPr>
+                <w:sz w:val="18"/>
+              </w:rPr>
+              <w:t>FactWeeklySales.time_key</w:t>
+            </w:r>
+          </w:p>
+        </w:tc>
+        <w:tc>
+          <w:tcPr>
+            <w:tcW w:type="dxa" w:w="2340"/>
+          </w:tcPr>
+          <w:p>
+            <w:r/>
+            <w:r>
+              <w:rPr>
+                <w:sz w:val="18"/>
+              </w:rPr>
+              <w:t>Surrogate Key</w:t>
+            </w:r>
+          </w:p>
+        </w:tc>
+      </w:tr>
+      <w:tr>
+        <w:tc>
+          <w:tcPr>
+            <w:tcW w:type="dxa" w:w="2340"/>
+          </w:tcPr>
+          <w:p>
+            <w:r/>
+            <w:r>
+              <w:rPr>
+                <w:sz w:val="18"/>
+              </w:rPr>
+              <w:t>stg_Movement_*.CATEGORY_CODE</w:t>
+            </w:r>
+          </w:p>
+        </w:tc>
+        <w:tc>
+          <w:tcPr>
+            <w:tcW w:type="dxa" w:w="2340"/>
+          </w:tcPr>
+          <w:p>
+            <w:r/>
+            <w:r>
+              <w:rPr>
+                <w:sz w:val="18"/>
+              </w:rPr>
+              <w:t>Lookup → DimCategory</w:t>
+            </w:r>
+          </w:p>
+        </w:tc>
+        <w:tc>
+          <w:tcPr>
+            <w:tcW w:type="dxa" w:w="2340"/>
+          </w:tcPr>
+          <w:p>
+            <w:r/>
+            <w:r>
+              <w:rPr>
+                <w:sz w:val="18"/>
+              </w:rPr>
+              <w:t>FactWeeklySales.category_key</w:t>
+            </w:r>
+          </w:p>
+        </w:tc>
+        <w:tc>
+          <w:tcPr>
+            <w:tcW w:type="dxa" w:w="2340"/>
+          </w:tcPr>
+          <w:p>
+            <w:r/>
+            <w:r>
+              <w:rPr>
+                <w:sz w:val="18"/>
+              </w:rPr>
+              <w:t>Surrogate Key</w:t>
+            </w:r>
+          </w:p>
+        </w:tc>
+      </w:tr>
+      <w:tr>
+        <w:tc>
+          <w:tcPr>
+            <w:tcW w:type="dxa" w:w="2340"/>
+          </w:tcPr>
+          <w:p>
+            <w:r/>
+            <w:r>
+              <w:rPr>
+                <w:sz w:val="18"/>
+              </w:rPr>
+              <w:t>stg_Movement_*.SALE</w:t>
+            </w:r>
+          </w:p>
+        </w:tc>
+        <w:tc>
+          <w:tcPr>
+            <w:tcW w:type="dxa" w:w="2340"/>
+          </w:tcPr>
+          <w:p>
+            <w:r/>
+            <w:r>
+              <w:rPr>
+                <w:sz w:val="18"/>
+              </w:rPr>
+              <w:t>Lookup → DimPromotion</w:t>
+            </w:r>
+          </w:p>
+        </w:tc>
+        <w:tc>
+          <w:tcPr>
+            <w:tcW w:type="dxa" w:w="2340"/>
+          </w:tcPr>
+          <w:p>
+            <w:r/>
+            <w:r>
+              <w:rPr>
+                <w:sz w:val="18"/>
+              </w:rPr>
+              <w:t>FactWeeklySales.promotion_key</w:t>
+            </w:r>
+          </w:p>
+        </w:tc>
+        <w:tc>
+          <w:tcPr>
+            <w:tcW w:type="dxa" w:w="2340"/>
+          </w:tcPr>
+          <w:p>
+            <w:r/>
+            <w:r>
+              <w:rPr>
+                <w:sz w:val="18"/>
+              </w:rPr>
+              <w:t>Surrogate Key</w:t>
+            </w:r>
+          </w:p>
+        </w:tc>
+      </w:tr>
+      <w:tr>
+        <w:tc>
+          <w:tcPr>
+            <w:tcW w:type="dxa" w:w="2340"/>
+          </w:tcPr>
+          <w:p>
+            <w:r/>
+            <w:r>
+              <w:rPr>
+                <w:sz w:val="18"/>
+              </w:rPr>
+              <w:t>stg_Store.PRICLOW/MED/HIGH</w:t>
+            </w:r>
+          </w:p>
+        </w:tc>
+        <w:tc>
+          <w:tcPr>
+            <w:tcW w:type="dxa" w:w="2340"/>
+          </w:tcPr>
+          <w:p>
+            <w:r/>
+            <w:r>
+              <w:rPr>
+                <w:sz w:val="18"/>
+              </w:rPr>
+              <w:t>CASE WHEN</w:t>
+            </w:r>
+          </w:p>
+        </w:tc>
+        <w:tc>
+          <w:tcPr>
+            <w:tcW w:type="dxa" w:w="2340"/>
+          </w:tcPr>
+          <w:p>
+            <w:r/>
+            <w:r>
+              <w:rPr>
+                <w:sz w:val="18"/>
+              </w:rPr>
+              <w:t>DimStore.price_tier</w:t>
+            </w:r>
+          </w:p>
+        </w:tc>
+        <w:tc>
+          <w:tcPr>
+            <w:tcW w:type="dxa" w:w="2340"/>
+          </w:tcPr>
+          <w:p>
+            <w:r/>
+            <w:r>
+              <w:rPr>
+                <w:sz w:val="18"/>
+              </w:rPr>
+              <w:t>Conditional</w:t>
+            </w:r>
+          </w:p>
+        </w:tc>
+      </w:tr>
+      <w:tr>
+        <w:tc>
+          <w:tcPr>
+            <w:tcW w:type="dxa" w:w="2340"/>
+          </w:tcPr>
+          <w:p>
+            <w:r/>
+            <w:r>
+              <w:rPr>
+                <w:sz w:val="18"/>
+              </w:rPr>
+              <w:t>stg_Store.* (remaining)</w:t>
+            </w:r>
+          </w:p>
+        </w:tc>
+        <w:tc>
+          <w:tcPr>
+            <w:tcW w:type="dxa" w:w="2340"/>
+          </w:tcPr>
+          <w:p>
+            <w:r/>
+            <w:r>
+              <w:rPr>
+                <w:sz w:val="18"/>
+              </w:rPr>
+              <w:t>CAST to proper types</w:t>
+            </w:r>
+          </w:p>
+        </w:tc>
+        <w:tc>
+          <w:tcPr>
+            <w:tcW w:type="dxa" w:w="2340"/>
+          </w:tcPr>
+          <w:p>
+            <w:r/>
+            <w:r>
+              <w:rPr>
+                <w:sz w:val="18"/>
+              </w:rPr>
+              <w:t>DimStore.*</w:t>
+            </w:r>
+          </w:p>
+        </w:tc>
+        <w:tc>
+          <w:tcPr>
+            <w:tcW w:type="dxa" w:w="2340"/>
+          </w:tcPr>
+          <w:p>
+            <w:r/>
+            <w:r>
+              <w:rPr>
+                <w:sz w:val="18"/>
+              </w:rPr>
+              <w:t>Type Conversion</w:t>
+            </w:r>
+          </w:p>
+        </w:tc>
+      </w:tr>
+      <w:tr>
+        <w:tc>
+          <w:tcPr>
+            <w:tcW w:type="dxa" w:w="2340"/>
+          </w:tcPr>
+          <w:p>
+            <w:r/>
+            <w:r>
+              <w:rPr>
+                <w:sz w:val="18"/>
+              </w:rPr>
+              <w:t>tmp_Product_All.DESCRIP</w:t>
+            </w:r>
+          </w:p>
+        </w:tc>
+        <w:tc>
+          <w:tcPr>
+            <w:tcW w:type="dxa" w:w="2340"/>
+          </w:tcPr>
+          <w:p>
+            <w:r/>
+            <w:r>
+              <w:rPr>
+                <w:sz w:val="18"/>
+              </w:rPr>
+              <w:t>Strip #, ~</w:t>
+            </w:r>
+          </w:p>
+        </w:tc>
+        <w:tc>
+          <w:tcPr>
+            <w:tcW w:type="dxa" w:w="2340"/>
+          </w:tcPr>
+          <w:p>
+            <w:r/>
+            <w:r>
+              <w:rPr>
+                <w:sz w:val="18"/>
+              </w:rPr>
+              <w:t>DimProduct.description</w:t>
+            </w:r>
+          </w:p>
+        </w:tc>
+        <w:tc>
+          <w:tcPr>
+            <w:tcW w:type="dxa" w:w="2340"/>
+          </w:tcPr>
+          <w:p>
+            <w:r/>
+            <w:r>
+              <w:rPr>
+                <w:sz w:val="18"/>
+              </w:rPr>
+              <w:t>String Cleaning</w:t>
+            </w:r>
+          </w:p>
+        </w:tc>
+      </w:tr>
+      <w:tr>
+        <w:tc>
+          <w:tcPr>
+            <w:tcW w:type="dxa" w:w="2340"/>
+          </w:tcPr>
+          <w:p>
+            <w:r/>
+            <w:r>
+              <w:rPr>
+                <w:sz w:val="18"/>
+              </w:rPr>
+              <w:t>(Generated) week_id 1–400</w:t>
+            </w:r>
+          </w:p>
+        </w:tc>
+        <w:tc>
+          <w:tcPr>
+            <w:tcW w:type="dxa" w:w="2340"/>
+          </w:tcPr>
+          <w:p>
+            <w:r/>
+            <w:r>
+              <w:rPr>
+                <w:sz w:val="18"/>
+              </w:rPr>
+              <w:t>DATEADD formula</w:t>
+            </w:r>
+          </w:p>
+        </w:tc>
+        <w:tc>
+          <w:tcPr>
+            <w:tcW w:type="dxa" w:w="2340"/>
+          </w:tcPr>
+          <w:p>
+            <w:r/>
+            <w:r>
+              <w:rPr>
+                <w:sz w:val="18"/>
+              </w:rPr>
+              <w:t>DimTime.week_start_date, month, quarter, year</w:t>
+            </w:r>
+          </w:p>
+        </w:tc>
+        <w:tc>
+          <w:tcPr>
+            <w:tcW w:type="dxa" w:w="2340"/>
+          </w:tcPr>
+          <w:p>
+            <w:r/>
+            <w:r>
+              <w:rPr>
+                <w:sz w:val="18"/>
+              </w:rPr>
+              <w:t>Date Calculation</w:t>
+            </w:r>
+          </w:p>
+        </w:tc>
+      </w:tr>
+      <w:tr>
+        <w:tc>
+          <w:tcPr>
+            <w:tcW w:type="dxa" w:w="2340"/>
+          </w:tcPr>
+          <w:p>
+            <w:r/>
+            <w:r>
+              <w:rPr>
+                <w:sz w:val="18"/>
+              </w:rPr>
+              <w:t>(Hardcoded) 28 category codes</w:t>
+            </w:r>
+          </w:p>
+        </w:tc>
+        <w:tc>
+          <w:tcPr>
+            <w:tcW w:type="dxa" w:w="2340"/>
+          </w:tcPr>
+          <w:p>
+            <w:r/>
+            <w:r>
+              <w:rPr>
+                <w:sz w:val="18"/>
+              </w:rPr>
+              <w:t>Direct INSERT</w:t>
+            </w:r>
+          </w:p>
+        </w:tc>
+        <w:tc>
+          <w:tcPr>
+            <w:tcW w:type="dxa" w:w="2340"/>
+          </w:tcPr>
+          <w:p>
+            <w:r/>
+            <w:r>
+              <w:rPr>
+                <w:sz w:val="18"/>
+              </w:rPr>
+              <w:t>DimCategory.*</w:t>
+            </w:r>
+          </w:p>
+        </w:tc>
+        <w:tc>
+          <w:tcPr>
+            <w:tcW w:type="dxa" w:w="2340"/>
+          </w:tcPr>
+          <w:p>
+            <w:r/>
+            <w:r>
+              <w:rPr>
+                <w:sz w:val="18"/>
+              </w:rPr>
+              <w:t>Static Data</w:t>
+            </w:r>
+          </w:p>
+        </w:tc>
+      </w:tr>
+      <w:tr>
+        <w:tc>
+          <w:tcPr>
+            <w:tcW w:type="dxa" w:w="2340"/>
+          </w:tcPr>
+          <w:p>
+            <w:r/>
+            <w:r>
+              <w:rPr>
+                <w:sz w:val="18"/>
+              </w:rPr>
+              <w:t>(Hardcoded) 4 deal types</w:t>
+            </w:r>
+          </w:p>
+        </w:tc>
+        <w:tc>
+          <w:tcPr>
+            <w:tcW w:type="dxa" w:w="2340"/>
+          </w:tcPr>
+          <w:p>
+            <w:r/>
+            <w:r>
+              <w:rPr>
+                <w:sz w:val="18"/>
+              </w:rPr>
+              <w:t>Direct INSERT</w:t>
+            </w:r>
+          </w:p>
+        </w:tc>
+        <w:tc>
+          <w:tcPr>
+            <w:tcW w:type="dxa" w:w="2340"/>
+          </w:tcPr>
+          <w:p>
+            <w:r/>
+            <w:r>
+              <w:rPr>
+                <w:sz w:val="18"/>
+              </w:rPr>
+              <w:t>DimPromotion.*</w:t>
+            </w:r>
+          </w:p>
+        </w:tc>
+        <w:tc>
+          <w:tcPr>
+            <w:tcW w:type="dxa" w:w="2340"/>
+          </w:tcPr>
+          <w:p>
+            <w:r/>
+            <w:r>
+              <w:rPr>
+                <w:sz w:val="18"/>
+              </w:rPr>
+              <w:t>Static Data</w:t>
+            </w:r>
+          </w:p>
+        </w:tc>
+      </w:tr>
+    </w:tbl>
+    <w:p/>
     <w:p>
       <w:pPr>
         <w:pStyle w:val="Heading2"/>

</xml_diff>

<commit_message>
R3→R4 continuity: real names, actual row counts, section renumbering, DOCX regen
</commit_message>
<xml_diff>
--- a/report_4/Integrated_Report_4.docx
+++ b/report_4/Integrated_Report_4.docx
@@ -8,7 +8,7 @@
         <w:jc w:val="center"/>
       </w:pPr>
       <w:r>
-        <w:t>Integrated Report: Design and Implementation of a Data Warehouse for Dominick's Fine Foods</w:t>
+        <w:t>Design and Implementation of a Data Warehouse for a Retail Store</w:t>
       </w:r>
     </w:p>
     <w:p>
@@ -24,6 +24,21 @@
       </w:r>
       <w:r>
         <w:t xml:space="preserve"> ISTM 637 – Data Warehousing, Spring 2026  </w:t>
+      </w:r>
+    </w:p>
+    <w:p>
+      <w:pPr>
+        <w:spacing w:after="40"/>
+      </w:pPr>
+      <w:r/>
+      <w:r>
+        <w:rPr>
+          <w:b/>
+        </w:rPr>
+        <w:t>University:</w:t>
+      </w:r>
+      <w:r>
+        <w:t xml:space="preserve"> Texas A&amp;M University  </w:t>
       </w:r>
     </w:p>
     <w:p>
@@ -53,7 +68,7 @@
         <w:t>Members:</w:t>
       </w:r>
       <w:r>
-        <w:t xml:space="preserve"> [Member 1 Name], [Member 2 Name], [Member 3 Name], [Member 4 Name]  </w:t>
+        <w:t xml:space="preserve"> Nisarg Sonar, Bhavik Dalal, Yifei Wang  </w:t>
       </w:r>
     </w:p>
     <w:p>
@@ -3287,7 +3302,7 @@
         <w:pStyle w:val="Heading2"/>
       </w:pPr>
       <w:r>
-        <w:t>Data Mart / Dimension Bus Matrix</w:t>
+        <w:t>3.1 Data Mart / Dimension Bus Matrix</w:t>
       </w:r>
     </w:p>
     <w:tbl>
@@ -3535,7 +3550,7 @@
         <w:pStyle w:val="Heading2"/>
       </w:pPr>
       <w:r>
-        <w:t>3.1 Data Warehouse Logical Design (Star Schema Design)</w:t>
+        <w:t>3.2 Data Warehouse Logical Design (Star Schema Design)</w:t>
       </w:r>
     </w:p>
     <w:p>
@@ -3543,7 +3558,7 @@
         <w:pStyle w:val="Heading2"/>
       </w:pPr>
       <w:r>
-        <w:t>3.2 Selected Business Questions</w:t>
+        <w:t>3.3 Selected Business Questions</w:t>
       </w:r>
     </w:p>
     <w:p>
@@ -4014,7 +4029,7 @@
         <w:pStyle w:val="Heading2"/>
       </w:pPr>
       <w:r>
-        <w:t>3.3 Star Schema — Table Definitions</w:t>
+        <w:t>3.4 Star Schema — Table Definitions</w:t>
       </w:r>
     </w:p>
     <w:p>
@@ -8238,7 +8253,7 @@
         <w:pStyle w:val="Heading2"/>
       </w:pPr>
       <w:r>
-        <w:t>3.4 Schema Justification — How Each BQ Is Supported</w:t>
+        <w:t>3.5 Schema Justification — How Each BQ Is Supported</w:t>
       </w:r>
     </w:p>
     <w:p>
@@ -8321,7 +8336,7 @@
         <w:pStyle w:val="Heading2"/>
       </w:pPr>
       <w:r>
-        <w:t>3.5 Star Schema Diagram</w:t>
+        <w:t>3.6 Star Schema Diagram</w:t>
       </w:r>
     </w:p>
     <w:tbl>
@@ -8365,7 +8380,7 @@
         <w:pStyle w:val="Heading2"/>
       </w:pPr>
       <w:r>
-        <w:t>3.6 Mapping Table #1: Source Files to Staging Tables</w:t>
+        <w:t>3.7 Mapping Table #1: Source Files to Staging Tables</w:t>
       </w:r>
     </w:p>
     <w:tbl>
@@ -15798,7 +15813,7 @@
         <w:pStyle w:val="Heading2"/>
       </w:pPr>
       <w:r>
-        <w:t>3.7 Mapping Table #2: Staging Tables to Data Mart Tables</w:t>
+        <w:t>3.8 Mapping Table #2: Staging Tables to Data Mart Tables</w:t>
       </w:r>
     </w:p>
     <w:tbl>
@@ -17559,7 +17574,7 @@
         <w:pStyle w:val="Heading2"/>
       </w:pPr>
       <w:r>
-        <w:t>3.8 Physical Design Plan</w:t>
+        <w:t>3.9 Physical Design Plan</w:t>
       </w:r>
     </w:p>
     <w:p>
@@ -18843,7 +18858,7 @@
     </w:p>
     <w:p>
       <w:r>
-        <w:t>Two mapping tables were prepared in Excel format (see Sections 3.6 and 3.7):</w:t>
+        <w:t>Two mapping tables were prepared in Excel format (see Sections 3.7 and 3.8):</w:t>
       </w:r>
     </w:p>
     <w:p>
@@ -23470,7 +23485,7 @@
               <w:rPr>
                 <w:sz w:val="18"/>
               </w:rPr>
-              <w:t>*[fill after execution]*</w:t>
+              <w:t>28</w:t>
             </w:r>
           </w:p>
         </w:tc>
@@ -23528,7 +23543,7 @@
               <w:rPr>
                 <w:sz w:val="18"/>
               </w:rPr>
-              <w:t>*[fill after execution]*</w:t>
+              <w:t>4</w:t>
             </w:r>
           </w:p>
         </w:tc>
@@ -23586,7 +23601,7 @@
               <w:rPr>
                 <w:sz w:val="18"/>
               </w:rPr>
-              <w:t>*[fill after execution]*</w:t>
+              <w:t>400</w:t>
             </w:r>
           </w:p>
         </w:tc>
@@ -23644,7 +23659,7 @@
               <w:rPr>
                 <w:sz w:val="18"/>
               </w:rPr>
-              <w:t>*[fill after execution]*</w:t>
+              <w:t>107</w:t>
             </w:r>
           </w:p>
         </w:tc>
@@ -23702,7 +23717,7 @@
               <w:rPr>
                 <w:sz w:val="18"/>
               </w:rPr>
-              <w:t>*[fill after execution]*</w:t>
+              <w:t>3,127</w:t>
             </w:r>
           </w:p>
         </w:tc>
@@ -23760,7 +23775,7 @@
               <w:rPr>
                 <w:sz w:val="18"/>
               </w:rPr>
-              <w:t>*[fill after execution]*</w:t>
+              <w:t>14,921,365</w:t>
             </w:r>
           </w:p>
         </w:tc>
@@ -23781,6 +23796,43 @@
       </w:tr>
     </w:tbl>
     <w:p/>
+    <w:p>
+      <w:pPr>
+        <w:spacing w:after="40"/>
+      </w:pPr>
+      <w:r/>
+      <w:r>
+        <w:rPr>
+          <w:b/>
+        </w:rPr>
+        <w:t>Note on FactWeeklySales row count:</w:t>
+      </w:r>
+      <w:r>
+        <w:t xml:space="preserve"> The estimated 34.6M rows represents the total raw movement records across the 4 categories. The actual loaded count of 14,921,365 reflects the application of two ETL quality filters: </w:t>
+      </w:r>
+      <w:r>
+        <w:rPr>
+          <w:rFonts w:ascii="Consolas" w:hAnsi="Consolas"/>
+          <w:color w:val="C0392B"/>
+          <w:sz w:val="18"/>
+        </w:rPr>
+        <w:t>OK = 1</w:t>
+      </w:r>
+      <w:r>
+        <w:t xml:space="preserve"> (retaining only quality-validated observations) and </w:t>
+      </w:r>
+      <w:r>
+        <w:rPr>
+          <w:rFonts w:ascii="Consolas" w:hAnsi="Consolas"/>
+          <w:color w:val="C0392B"/>
+          <w:sz w:val="18"/>
+        </w:rPr>
+        <w:t>PRICE &gt; 0</w:t>
+      </w:r>
+      <w:r>
+        <w:t xml:space="preserve"> (excluding zero-price rows that would cause division errors in derived columns). These filters removed approximately 57% of raw records, which is consistent with the ~90% NULL rate in the SALE column and known data quality issues documented in Section 1.4.</w:t>
+      </w:r>
+    </w:p>
     <w:p>
       <w:pPr>
         <w:spacing w:before="120" w:after="120"/>

</xml_diff>